<commit_message>
Update Rapport de projet test.docx
</commit_message>
<xml_diff>
--- a/WIP/rapport de projet/Rapport de projet test.docx
+++ b/WIP/rapport de projet/Rapport de projet test.docx
@@ -1588,7 +1588,7 @@
       </w:r>
       <w:proofErr w:type="spellEnd"/>
       <w:r>
-        <w:t xml:space="preserve"> pour que chacun puisse voir une version du projet à jour. </w:t>
+        <w:t xml:space="preserve"> pour que chacun puisse voir une version du projet à jour.</w:t>
       </w:r>
     </w:p>
     <w:p>
@@ -1597,7 +1597,7 @@
         <w:jc w:val="both"/>
       </w:pPr>
       <w:r>
-        <w:t xml:space="preserve">Un journal personnel est aussi utilisé sous forme de fichier CSV. Ce journal permet de suivre l'avancement du projet et de recenser les problèmes rencontrés. Ainsi, si une des deux personnes est absente, il est toujours possible de suivre l'avancement du projet. Le but est qu'aucun événement ne ralentisse l'avancement et le bon déroulement du projet. </w:t>
+        <w:t>Un journal personnel est aussi utilisé sous forme de fichier CSV. Ce journal permet de suivre l'avancement du projet et de recenser les problèmes rencontrés. Ainsi, si une des deux personnes est absente, il est toujours possible de suivre l'avancement du projet. Le but est qu'aucun événement ne ralentisse l'avancement et le bon déroulement du projet.</w:t>
       </w:r>
     </w:p>
     <w:p>
@@ -1743,7 +1743,7 @@
           <w:szCs w:val="14"/>
         </w:rPr>
         <w:lastRenderedPageBreak/>
-        <w:t xml:space="preserve">qui nous était spécifiquement demandé et avons cherché à comprendre le CDC afin de pouvoir au mieux planifier les tâches principales. </w:t>
+        <w:t>qui nous était spécifiquement demandé et avons cherché à comprendre le CDC afin de pouvoir au mieux planifier les tâches principales.</w:t>
       </w:r>
     </w:p>
     <w:p>
@@ -1758,7 +1758,7 @@
         <w:rPr>
           <w:szCs w:val="14"/>
         </w:rPr>
-        <w:t xml:space="preserve">Nous avons réfléchi à ce qui était le plus important à faire au début, comme la mise en place de l’environnement, ainsi qu’aux différentes étapes nécessaires pour avancer efficacement, petit à petit, dans le projet. </w:t>
+        <w:t>Nous avons réfléchi à ce qui était le plus important à faire au début, comme la mise en place de l’environnement, ainsi qu’aux différentes étapes nécessaires pour avancer efficacement, petit à petit, dans le projet.</w:t>
       </w:r>
     </w:p>
     <w:p>
@@ -2016,7 +2016,7 @@
       </w:r>
       <w:proofErr w:type="spellEnd"/>
       <w:r>
-        <w:t xml:space="preserve">, qui comprend un frontend Vue.js, un backend Node.js/Express, et une base de données MongoDB. </w:t>
+        <w:t>, qui comprend un frontend Vue.js, un backend Node.js/Express, et une base de données MongoDB.</w:t>
       </w:r>
     </w:p>
     <w:p>
@@ -2255,7 +2255,7 @@
           <w:szCs w:val="26"/>
           <w:u w:val="single"/>
         </w:rPr>
-        <w:t xml:space="preserve">Tests unitaires </w:t>
+        <w:t>Tests unitaires</w:t>
       </w:r>
     </w:p>
     <w:p>
@@ -2408,13 +2408,6 @@
           <w:szCs w:val="26"/>
         </w:rPr>
         <w:t>Outils :</w:t>
-      </w:r>
-      <w:r>
-        <w:rPr>
-          <w:sz w:val="26"/>
-          <w:szCs w:val="26"/>
-        </w:rPr>
-        <w:t xml:space="preserve"> </w:t>
       </w:r>
     </w:p>
     <w:p>
@@ -2859,9 +2852,6 @@
       <w:pPr>
         <w:jc w:val="both"/>
       </w:pPr>
-      <w:r>
-        <w:tab/>
-      </w:r>
     </w:p>
     <w:p>
       <w:pPr>
@@ -3161,13 +3151,6 @@
         </w:rPr>
         <w:t>Authentification</w:t>
       </w:r>
-      <w:r>
-        <w:rPr>
-          <w:sz w:val="26"/>
-          <w:szCs w:val="26"/>
-        </w:rPr>
-        <w:t xml:space="preserve"> </w:t>
-      </w:r>
     </w:p>
     <w:p>
       <w:pPr>
@@ -3175,7 +3158,7 @@
         <w:jc w:val="both"/>
       </w:pPr>
       <w:r>
-        <w:t xml:space="preserve">Ces tests ont pour but de vérifier le système d’authentification de l’application pour d’assurer que le fonctionnement et les sorties de la fonctionnalité soit correct. </w:t>
+        <w:t>Ces tests ont pour but de vérifier le système d’authentification de l’application pour d’assurer que le fonctionnement et les sorties de la fonctionnalité soit correct.</w:t>
       </w:r>
     </w:p>
     <w:p>
@@ -3303,7 +3286,7 @@
         <w:jc w:val="both"/>
       </w:pPr>
       <w:r>
-        <w:t xml:space="preserve">Voici comment cela se mets en place dans le code. </w:t>
+        <w:t>Voici comment cela se mets en place dans le code.</w:t>
       </w:r>
     </w:p>
     <w:p>
@@ -3413,9 +3396,6 @@
         <w:ind w:left="360"/>
         <w:jc w:val="both"/>
       </w:pPr>
-      <w:r>
-        <w:t xml:space="preserve"> </w:t>
-      </w:r>
       <w:r>
         <w:rPr>
           <w:noProof/>
@@ -3860,7 +3840,7 @@
               <w:jc w:val="both"/>
             </w:pPr>
             <w:r>
-              <w:t xml:space="preserve">Présence d’un body dans la réponse du server </w:t>
+              <w:t>Présence d’un body dans la réponse du server</w:t>
             </w:r>
           </w:p>
         </w:tc>
@@ -4137,7 +4117,7 @@
       </w:r>
       <w:proofErr w:type="gramEnd"/>
       <w:r>
-        <w:t xml:space="preserve">. </w:t>
+        <w:t>.</w:t>
       </w:r>
     </w:p>
     <w:p>
@@ -5058,7 +5038,7 @@
         <w:jc w:val="both"/>
       </w:pPr>
       <w:r>
-        <w:t xml:space="preserve">Mise à jour du lieu </w:t>
+        <w:t>Mise à jour du lieu</w:t>
       </w:r>
     </w:p>
     <w:p>
@@ -6986,9 +6966,6 @@
         <w:jc w:val="both"/>
       </w:pPr>
       <w:r>
-        <w:t xml:space="preserve"> </w:t>
-      </w:r>
-      <w:r>
         <w:t xml:space="preserve">Format </w:t>
       </w:r>
       <w:proofErr w:type="gramStart"/>
@@ -7009,9 +6986,6 @@
         </w:numPr>
         <w:jc w:val="both"/>
       </w:pPr>
-      <w:r>
-        <w:t xml:space="preserve"> </w:t>
-      </w:r>
       <w:bookmarkStart w:id="14" w:name="_Hlk186984248"/>
       <w:r>
         <w:t>Utilisateur inexistant</w:t>
@@ -7028,7 +7002,7 @@
         <w:jc w:val="both"/>
       </w:pPr>
       <w:r>
-        <w:t xml:space="preserve"> Mauvais mot de passe</w:t>
+        <w:t>Mauvais mot de passe</w:t>
       </w:r>
     </w:p>
     <w:p>
@@ -7041,7 +7015,7 @@
         <w:jc w:val="both"/>
       </w:pPr>
       <w:r>
-        <w:t xml:space="preserve"> Connexion réussie</w:t>
+        <w:t>Connexion réussie</w:t>
       </w:r>
     </w:p>
     <w:p>
@@ -7278,13 +7252,41 @@
         </w:drawing>
       </w:r>
     </w:p>
-    <w:p/>
-    <w:p/>
-    <w:p/>
-    <w:p/>
-    <w:p/>
-    <w:p/>
-    <w:p/>
+    <w:p>
+      <w:pPr>
+        <w:jc w:val="both"/>
+      </w:pPr>
+    </w:p>
+    <w:p>
+      <w:pPr>
+        <w:jc w:val="both"/>
+      </w:pPr>
+    </w:p>
+    <w:p>
+      <w:pPr>
+        <w:jc w:val="both"/>
+      </w:pPr>
+    </w:p>
+    <w:p>
+      <w:pPr>
+        <w:jc w:val="both"/>
+      </w:pPr>
+    </w:p>
+    <w:p>
+      <w:pPr>
+        <w:jc w:val="both"/>
+      </w:pPr>
+    </w:p>
+    <w:p>
+      <w:pPr>
+        <w:jc w:val="both"/>
+      </w:pPr>
+    </w:p>
+    <w:p>
+      <w:pPr>
+        <w:jc w:val="both"/>
+      </w:pPr>
+    </w:p>
     <w:p>
       <w:pPr>
         <w:pStyle w:val="Paragraphedeliste"/>
@@ -7317,6 +7319,7 @@
     <w:p>
       <w:pPr>
         <w:ind w:left="708"/>
+        <w:jc w:val="both"/>
       </w:pPr>
       <w:r>
         <w:drawing>
@@ -7378,21 +7381,47 @@
       <w:r>
         <w:t xml:space="preserve"> inexistant.</w:t>
       </w:r>
-      <w:r>
-        <w:rPr>
-          <w:noProof/>
-        </w:rPr>
-        <w:t xml:space="preserve"> </w:t>
-      </w:r>
-    </w:p>
-    <w:p/>
-    <w:p/>
-    <w:p/>
-    <w:p/>
-    <w:p/>
-    <w:p/>
-    <w:p/>
-    <w:p/>
+    </w:p>
+    <w:p>
+      <w:pPr>
+        <w:jc w:val="both"/>
+      </w:pPr>
+    </w:p>
+    <w:p>
+      <w:pPr>
+        <w:jc w:val="both"/>
+      </w:pPr>
+    </w:p>
+    <w:p>
+      <w:pPr>
+        <w:jc w:val="both"/>
+      </w:pPr>
+    </w:p>
+    <w:p>
+      <w:pPr>
+        <w:jc w:val="both"/>
+      </w:pPr>
+    </w:p>
+    <w:p>
+      <w:pPr>
+        <w:jc w:val="both"/>
+      </w:pPr>
+    </w:p>
+    <w:p>
+      <w:pPr>
+        <w:jc w:val="both"/>
+      </w:pPr>
+    </w:p>
+    <w:p>
+      <w:pPr>
+        <w:jc w:val="both"/>
+      </w:pPr>
+    </w:p>
+    <w:p>
+      <w:pPr>
+        <w:jc w:val="both"/>
+      </w:pPr>
+    </w:p>
     <w:p>
       <w:pPr>
         <w:tabs>
@@ -7489,9 +7518,6 @@
         </w:drawing>
       </w:r>
       <w:r>
-        <w:tab/>
-      </w:r>
-      <w:r>
         <w:t>Ce test vérifie que la connexion échoue si le mot de passe est incorrect</w:t>
       </w:r>
       <w:r>
@@ -7613,20 +7639,42 @@
       <w:r>
         <w:t>.</w:t>
       </w:r>
-      <w:r>
-        <w:rPr>
-          <w:noProof/>
-        </w:rPr>
-        <w:t xml:space="preserve"> </w:t>
-      </w:r>
-    </w:p>
-    <w:p/>
-    <w:p/>
-    <w:p/>
-    <w:p/>
-    <w:p/>
-    <w:p/>
-    <w:p/>
+    </w:p>
+    <w:p>
+      <w:pPr>
+        <w:jc w:val="both"/>
+      </w:pPr>
+    </w:p>
+    <w:p>
+      <w:pPr>
+        <w:jc w:val="both"/>
+      </w:pPr>
+    </w:p>
+    <w:p>
+      <w:pPr>
+        <w:jc w:val="both"/>
+      </w:pPr>
+    </w:p>
+    <w:p>
+      <w:pPr>
+        <w:jc w:val="both"/>
+      </w:pPr>
+    </w:p>
+    <w:p>
+      <w:pPr>
+        <w:jc w:val="both"/>
+      </w:pPr>
+    </w:p>
+    <w:p>
+      <w:pPr>
+        <w:jc w:val="both"/>
+      </w:pPr>
+    </w:p>
+    <w:p>
+      <w:pPr>
+        <w:jc w:val="both"/>
+      </w:pPr>
+    </w:p>
     <w:p>
       <w:pPr>
         <w:pStyle w:val="Titre3"/>
@@ -7651,6 +7699,7 @@
     <w:p>
       <w:pPr>
         <w:ind w:left="360"/>
+        <w:jc w:val="both"/>
       </w:pPr>
       <w:r>
         <w:t>La gestion du profil permet aux utilisateurs de consulter et modifier leurs informations. Les tests vérifient si les informations actuelles sont affichées, si les modifications sont prises en compte, et si les erreurs sont bien gérées.</w:t>
@@ -7659,6 +7708,7 @@
     <w:p>
       <w:pPr>
         <w:ind w:left="360"/>
+        <w:jc w:val="both"/>
       </w:pPr>
       <w:r>
         <w:t xml:space="preserve">Voici </w:t>
@@ -7679,6 +7729,7 @@
           <w:ilvl w:val="0"/>
           <w:numId w:val="27"/>
         </w:numPr>
+        <w:jc w:val="both"/>
       </w:pPr>
       <w:r>
         <w:t>Affichage des informations actuelles</w:t>
@@ -7691,6 +7742,7 @@
           <w:ilvl w:val="0"/>
           <w:numId w:val="27"/>
         </w:numPr>
+        <w:jc w:val="both"/>
       </w:pPr>
       <w:bookmarkStart w:id="15" w:name="_Hlk186984834"/>
       <w:r>
@@ -7705,12 +7757,17 @@
           <w:ilvl w:val="0"/>
           <w:numId w:val="27"/>
         </w:numPr>
+        <w:jc w:val="both"/>
       </w:pPr>
       <w:r>
         <w:t>Mise à jour avec des valeurs valides</w:t>
       </w:r>
     </w:p>
-    <w:p/>
+    <w:p>
+      <w:pPr>
+        <w:jc w:val="both"/>
+      </w:pPr>
+    </w:p>
     <w:p>
       <w:pPr>
         <w:pStyle w:val="Paragraphedeliste"/>
@@ -7745,6 +7802,7 @@
     <w:p>
       <w:pPr>
         <w:ind w:left="360" w:firstLine="348"/>
+        <w:jc w:val="both"/>
       </w:pPr>
       <w:r>
         <w:t xml:space="preserve">Ce test vérifie que </w:t>
@@ -7763,6 +7821,7 @@
         <w:tabs>
           <w:tab w:val="left" w:pos="930"/>
         </w:tabs>
+        <w:jc w:val="both"/>
       </w:pPr>
       <w:r>
         <w:drawing>
@@ -7816,17 +7875,61 @@
         </w:drawing>
       </w:r>
     </w:p>
-    <w:p/>
-    <w:p/>
-    <w:p/>
-    <w:p/>
-    <w:p/>
-    <w:p/>
-    <w:p/>
-    <w:p/>
-    <w:p/>
-    <w:p/>
-    <w:p/>
+    <w:p>
+      <w:pPr>
+        <w:jc w:val="both"/>
+      </w:pPr>
+    </w:p>
+    <w:p>
+      <w:pPr>
+        <w:jc w:val="both"/>
+      </w:pPr>
+    </w:p>
+    <w:p>
+      <w:pPr>
+        <w:jc w:val="both"/>
+      </w:pPr>
+    </w:p>
+    <w:p>
+      <w:pPr>
+        <w:jc w:val="both"/>
+      </w:pPr>
+    </w:p>
+    <w:p>
+      <w:pPr>
+        <w:jc w:val="both"/>
+      </w:pPr>
+    </w:p>
+    <w:p>
+      <w:pPr>
+        <w:jc w:val="both"/>
+      </w:pPr>
+    </w:p>
+    <w:p>
+      <w:pPr>
+        <w:jc w:val="both"/>
+      </w:pPr>
+    </w:p>
+    <w:p>
+      <w:pPr>
+        <w:jc w:val="both"/>
+      </w:pPr>
+    </w:p>
+    <w:p>
+      <w:pPr>
+        <w:jc w:val="both"/>
+      </w:pPr>
+    </w:p>
+    <w:p>
+      <w:pPr>
+        <w:jc w:val="both"/>
+      </w:pPr>
+    </w:p>
+    <w:p>
+      <w:pPr>
+        <w:jc w:val="both"/>
+      </w:pPr>
+    </w:p>
     <w:p>
       <w:pPr>
         <w:pStyle w:val="Paragraphedeliste"/>
@@ -7834,6 +7937,7 @@
           <w:ilvl w:val="0"/>
           <w:numId w:val="28"/>
         </w:numPr>
+        <w:jc w:val="both"/>
         <w:rPr>
           <w:b/>
           <w:bCs/>
@@ -7861,6 +7965,7 @@
     <w:p>
       <w:pPr>
         <w:ind w:left="708"/>
+        <w:jc w:val="both"/>
       </w:pPr>
       <w:r>
         <w:t>Ce test vérifie que l</w:t>
@@ -7923,7 +8028,11 @@
         </w:drawing>
       </w:r>
     </w:p>
-    <w:p/>
+    <w:p>
+      <w:pPr>
+        <w:jc w:val="both"/>
+      </w:pPr>
+    </w:p>
     <w:p>
       <w:pPr>
         <w:pStyle w:val="Paragraphedeliste"/>
@@ -7931,6 +8040,7 @@
           <w:ilvl w:val="0"/>
           <w:numId w:val="28"/>
         </w:numPr>
+        <w:jc w:val="both"/>
         <w:rPr>
           <w:b/>
           <w:bCs/>
@@ -7957,6 +8067,7 @@
     <w:p>
       <w:pPr>
         <w:ind w:left="708"/>
+        <w:jc w:val="both"/>
       </w:pPr>
       <w:r>
         <w:drawing>
@@ -8022,10 +8133,19 @@
     <w:p>
       <w:pPr>
         <w:ind w:left="708"/>
-      </w:pPr>
-    </w:p>
-    <w:p/>
-    <w:p/>
+        <w:jc w:val="both"/>
+      </w:pPr>
+    </w:p>
+    <w:p>
+      <w:pPr>
+        <w:jc w:val="both"/>
+      </w:pPr>
+    </w:p>
+    <w:p>
+      <w:pPr>
+        <w:jc w:val="both"/>
+      </w:pPr>
+    </w:p>
     <w:p>
       <w:pPr>
         <w:pStyle w:val="Titre3"/>
@@ -8068,6 +8188,7 @@
     <w:p>
       <w:pPr>
         <w:ind w:left="360"/>
+        <w:jc w:val="both"/>
       </w:pPr>
       <w:r>
         <w:t xml:space="preserve">Ces tests permettent de vérifier </w:t>
@@ -8094,6 +8215,7 @@
     <w:p>
       <w:pPr>
         <w:ind w:left="360"/>
+        <w:jc w:val="both"/>
       </w:pPr>
       <w:r>
         <w:t>Voici les cas testés :</w:t>
@@ -8106,6 +8228,7 @@
           <w:ilvl w:val="0"/>
           <w:numId w:val="30"/>
         </w:numPr>
+        <w:jc w:val="both"/>
       </w:pPr>
       <w:r>
         <w:t>Champs vides</w:t>
@@ -8118,6 +8241,7 @@
           <w:ilvl w:val="0"/>
           <w:numId w:val="30"/>
         </w:numPr>
+        <w:jc w:val="both"/>
       </w:pPr>
       <w:bookmarkStart w:id="16" w:name="_Hlk186985346"/>
       <w:r>
@@ -8132,6 +8256,7 @@
           <w:ilvl w:val="0"/>
           <w:numId w:val="30"/>
         </w:numPr>
+        <w:jc w:val="both"/>
       </w:pPr>
       <w:r>
         <w:t>Validation des tâches</w:t>
@@ -8144,12 +8269,17 @@
           <w:ilvl w:val="0"/>
           <w:numId w:val="30"/>
         </w:numPr>
+        <w:jc w:val="both"/>
       </w:pPr>
       <w:r>
         <w:t>Suppression des tâches</w:t>
       </w:r>
     </w:p>
-    <w:p/>
+    <w:p>
+      <w:pPr>
+        <w:jc w:val="both"/>
+      </w:pPr>
+    </w:p>
     <w:p>
       <w:pPr>
         <w:pStyle w:val="Paragraphedeliste"/>
@@ -8277,6 +8407,7 @@
     <w:p>
       <w:pPr>
         <w:ind w:left="708"/>
+        <w:jc w:val="both"/>
       </w:pPr>
       <w:r>
         <w:drawing>
@@ -8339,16 +8470,56 @@
         <w:t>Ce test vérifie que l’utilisateur peut ajouter des tâches avec et qu’elles s’affichent correctement dans la liste.</w:t>
       </w:r>
     </w:p>
-    <w:p/>
-    <w:p/>
-    <w:p/>
-    <w:p/>
-    <w:p/>
-    <w:p/>
-    <w:p/>
-    <w:p/>
-    <w:p/>
-    <w:p/>
+    <w:p>
+      <w:pPr>
+        <w:jc w:val="both"/>
+      </w:pPr>
+    </w:p>
+    <w:p>
+      <w:pPr>
+        <w:jc w:val="both"/>
+      </w:pPr>
+    </w:p>
+    <w:p>
+      <w:pPr>
+        <w:jc w:val="both"/>
+      </w:pPr>
+    </w:p>
+    <w:p>
+      <w:pPr>
+        <w:jc w:val="both"/>
+      </w:pPr>
+    </w:p>
+    <w:p>
+      <w:pPr>
+        <w:jc w:val="both"/>
+      </w:pPr>
+    </w:p>
+    <w:p>
+      <w:pPr>
+        <w:jc w:val="both"/>
+      </w:pPr>
+    </w:p>
+    <w:p>
+      <w:pPr>
+        <w:jc w:val="both"/>
+      </w:pPr>
+    </w:p>
+    <w:p>
+      <w:pPr>
+        <w:jc w:val="both"/>
+      </w:pPr>
+    </w:p>
+    <w:p>
+      <w:pPr>
+        <w:jc w:val="both"/>
+      </w:pPr>
+    </w:p>
+    <w:p>
+      <w:pPr>
+        <w:jc w:val="both"/>
+      </w:pPr>
+    </w:p>
     <w:p>
       <w:pPr>
         <w:pStyle w:val="Paragraphedeliste"/>
@@ -8420,6 +8591,7 @@
     <w:p>
       <w:pPr>
         <w:ind w:left="708"/>
+        <w:jc w:val="both"/>
       </w:pPr>
       <w:r>
         <w:t xml:space="preserve">Ce test vérifie que l’utilisateur peut marquer des tâches comme </w:t>
@@ -8434,6 +8606,7 @@
     <w:p>
       <w:pPr>
         <w:ind w:left="708"/>
+        <w:jc w:val="both"/>
       </w:pPr>
       <w:r>
         <w:drawing>
@@ -8487,15 +8660,51 @@
         </w:drawing>
       </w:r>
     </w:p>
-    <w:p/>
-    <w:p/>
-    <w:p/>
-    <w:p/>
-    <w:p/>
-    <w:p/>
-    <w:p/>
-    <w:p/>
-    <w:p/>
+    <w:p>
+      <w:pPr>
+        <w:jc w:val="both"/>
+      </w:pPr>
+    </w:p>
+    <w:p>
+      <w:pPr>
+        <w:jc w:val="both"/>
+      </w:pPr>
+    </w:p>
+    <w:p>
+      <w:pPr>
+        <w:jc w:val="both"/>
+      </w:pPr>
+    </w:p>
+    <w:p>
+      <w:pPr>
+        <w:jc w:val="both"/>
+      </w:pPr>
+    </w:p>
+    <w:p>
+      <w:pPr>
+        <w:jc w:val="both"/>
+      </w:pPr>
+    </w:p>
+    <w:p>
+      <w:pPr>
+        <w:jc w:val="both"/>
+      </w:pPr>
+    </w:p>
+    <w:p>
+      <w:pPr>
+        <w:jc w:val="both"/>
+      </w:pPr>
+    </w:p>
+    <w:p>
+      <w:pPr>
+        <w:jc w:val="both"/>
+      </w:pPr>
+    </w:p>
+    <w:p>
+      <w:pPr>
+        <w:jc w:val="both"/>
+      </w:pPr>
+    </w:p>
     <w:p>
       <w:pPr>
         <w:pStyle w:val="Paragraphedeliste"/>
@@ -8644,6 +8853,7 @@
     <w:p>
       <w:pPr>
         <w:ind w:firstLine="708"/>
+        <w:jc w:val="both"/>
       </w:pPr>
     </w:p>
     <w:p>
@@ -8670,6 +8880,7 @@
     <w:p>
       <w:pPr>
         <w:ind w:left="360"/>
+        <w:jc w:val="both"/>
       </w:pPr>
       <w:r>
         <w:t xml:space="preserve">Ces tests valident la navigation entre les différentes pages de l’application </w:t>
@@ -8684,21 +8895,25 @@
     <w:p>
       <w:pPr>
         <w:ind w:left="360"/>
+        <w:jc w:val="both"/>
       </w:pPr>
     </w:p>
     <w:p>
       <w:pPr>
         <w:ind w:left="360"/>
+        <w:jc w:val="both"/>
       </w:pPr>
     </w:p>
     <w:p>
       <w:pPr>
         <w:ind w:left="360"/>
+        <w:jc w:val="both"/>
       </w:pPr>
     </w:p>
     <w:p>
       <w:pPr>
         <w:ind w:left="360"/>
+        <w:jc w:val="both"/>
       </w:pPr>
       <w:r>
         <w:lastRenderedPageBreak/>
@@ -8712,6 +8927,7 @@
           <w:ilvl w:val="0"/>
           <w:numId w:val="32"/>
         </w:numPr>
+        <w:jc w:val="both"/>
       </w:pPr>
       <w:r>
         <w:t>Changement de mode clair/sombre</w:t>
@@ -8724,6 +8940,7 @@
           <w:ilvl w:val="0"/>
           <w:numId w:val="32"/>
         </w:numPr>
+        <w:jc w:val="both"/>
       </w:pPr>
       <w:bookmarkStart w:id="17" w:name="_Hlk186985856"/>
       <w:r>
@@ -8738,9 +8955,10 @@
           <w:ilvl w:val="0"/>
           <w:numId w:val="32"/>
         </w:numPr>
-      </w:pPr>
-      <w:r>
-        <w:t xml:space="preserve">Navigation vers la page "Profil" </w:t>
+        <w:jc w:val="both"/>
+      </w:pPr>
+      <w:r>
+        <w:t>Navigation vers la page "Profil"</w:t>
       </w:r>
     </w:p>
     <w:p>
@@ -8750,12 +8968,17 @@
           <w:ilvl w:val="0"/>
           <w:numId w:val="32"/>
         </w:numPr>
+        <w:jc w:val="both"/>
       </w:pPr>
       <w:r>
         <w:t>Retour à l’accueil via le logo</w:t>
       </w:r>
     </w:p>
-    <w:p/>
+    <w:p>
+      <w:pPr>
+        <w:jc w:val="both"/>
+      </w:pPr>
+    </w:p>
     <w:p>
       <w:pPr>
         <w:pStyle w:val="Paragraphedeliste"/>
@@ -8898,17 +9121,61 @@
         </w:rPr>
       </w:pPr>
     </w:p>
-    <w:p/>
-    <w:p/>
-    <w:p/>
-    <w:p/>
-    <w:p/>
-    <w:p/>
-    <w:p/>
-    <w:p/>
-    <w:p/>
-    <w:p/>
-    <w:p/>
+    <w:p>
+      <w:pPr>
+        <w:jc w:val="both"/>
+      </w:pPr>
+    </w:p>
+    <w:p>
+      <w:pPr>
+        <w:jc w:val="both"/>
+      </w:pPr>
+    </w:p>
+    <w:p>
+      <w:pPr>
+        <w:jc w:val="both"/>
+      </w:pPr>
+    </w:p>
+    <w:p>
+      <w:pPr>
+        <w:jc w:val="both"/>
+      </w:pPr>
+    </w:p>
+    <w:p>
+      <w:pPr>
+        <w:jc w:val="both"/>
+      </w:pPr>
+    </w:p>
+    <w:p>
+      <w:pPr>
+        <w:jc w:val="both"/>
+      </w:pPr>
+    </w:p>
+    <w:p>
+      <w:pPr>
+        <w:jc w:val="both"/>
+      </w:pPr>
+    </w:p>
+    <w:p>
+      <w:pPr>
+        <w:jc w:val="both"/>
+      </w:pPr>
+    </w:p>
+    <w:p>
+      <w:pPr>
+        <w:jc w:val="both"/>
+      </w:pPr>
+    </w:p>
+    <w:p>
+      <w:pPr>
+        <w:jc w:val="both"/>
+      </w:pPr>
+    </w:p>
+    <w:p>
+      <w:pPr>
+        <w:jc w:val="both"/>
+      </w:pPr>
+    </w:p>
     <w:p>
       <w:pPr>
         <w:pStyle w:val="Paragraphedeliste"/>
@@ -8943,6 +9210,7 @@
     <w:p>
       <w:pPr>
         <w:ind w:left="708"/>
+        <w:jc w:val="both"/>
       </w:pPr>
       <w:bookmarkStart w:id="18" w:name="_Hlk186986379"/>
       <w:r>
@@ -8956,6 +9224,7 @@
     <w:p>
       <w:pPr>
         <w:ind w:left="708"/>
+        <w:jc w:val="both"/>
       </w:pPr>
       <w:r>
         <w:drawing>
@@ -9018,36 +9287,43 @@
     <w:p>
       <w:pPr>
         <w:ind w:left="708"/>
+        <w:jc w:val="both"/>
       </w:pPr>
     </w:p>
     <w:p>
       <w:pPr>
         <w:ind w:left="708"/>
+        <w:jc w:val="both"/>
       </w:pPr>
     </w:p>
     <w:p>
       <w:pPr>
         <w:ind w:left="708"/>
+        <w:jc w:val="both"/>
       </w:pPr>
     </w:p>
     <w:p>
       <w:pPr>
         <w:ind w:left="708"/>
+        <w:jc w:val="both"/>
       </w:pPr>
     </w:p>
     <w:p>
       <w:pPr>
         <w:ind w:left="708"/>
+        <w:jc w:val="both"/>
       </w:pPr>
     </w:p>
     <w:p>
       <w:pPr>
         <w:ind w:left="708"/>
+        <w:jc w:val="both"/>
       </w:pPr>
     </w:p>
     <w:p>
       <w:pPr>
         <w:ind w:left="708"/>
+        <w:jc w:val="both"/>
       </w:pPr>
     </w:p>
     <w:p>
@@ -9109,6 +9385,7 @@
     <w:p>
       <w:pPr>
         <w:ind w:left="360" w:firstLine="348"/>
+        <w:jc w:val="both"/>
       </w:pPr>
       <w:bookmarkStart w:id="19" w:name="_Hlk186986014"/>
       <w:r>
@@ -9122,6 +9399,7 @@
     <w:p>
       <w:pPr>
         <w:ind w:left="708"/>
+        <w:jc w:val="both"/>
       </w:pPr>
       <w:r>
         <w:drawing>
@@ -9175,15 +9453,51 @@
         </w:drawing>
       </w:r>
     </w:p>
-    <w:p/>
-    <w:p/>
-    <w:p/>
-    <w:p/>
-    <w:p/>
-    <w:p/>
-    <w:p/>
-    <w:p/>
-    <w:p/>
+    <w:p>
+      <w:pPr>
+        <w:jc w:val="both"/>
+      </w:pPr>
+    </w:p>
+    <w:p>
+      <w:pPr>
+        <w:jc w:val="both"/>
+      </w:pPr>
+    </w:p>
+    <w:p>
+      <w:pPr>
+        <w:jc w:val="both"/>
+      </w:pPr>
+    </w:p>
+    <w:p>
+      <w:pPr>
+        <w:jc w:val="both"/>
+      </w:pPr>
+    </w:p>
+    <w:p>
+      <w:pPr>
+        <w:jc w:val="both"/>
+      </w:pPr>
+    </w:p>
+    <w:p>
+      <w:pPr>
+        <w:jc w:val="both"/>
+      </w:pPr>
+    </w:p>
+    <w:p>
+      <w:pPr>
+        <w:jc w:val="both"/>
+      </w:pPr>
+    </w:p>
+    <w:p>
+      <w:pPr>
+        <w:jc w:val="both"/>
+      </w:pPr>
+    </w:p>
+    <w:p>
+      <w:pPr>
+        <w:jc w:val="both"/>
+      </w:pPr>
+    </w:p>
     <w:p>
       <w:pPr>
         <w:pStyle w:val="Paragraphedeliste"/>
@@ -9218,6 +9532,7 @@
     <w:p>
       <w:pPr>
         <w:ind w:left="360" w:firstLine="348"/>
+        <w:jc w:val="both"/>
       </w:pPr>
       <w:r>
         <w:t xml:space="preserve">Ce test vérifie que l’utilisateur peut </w:t>
@@ -9237,6 +9552,7 @@
     <w:p>
       <w:pPr>
         <w:ind w:left="360" w:firstLine="348"/>
+        <w:jc w:val="both"/>
       </w:pPr>
       <w:r>
         <w:drawing>
@@ -9295,15 +9611,44 @@
         <w:tabs>
           <w:tab w:val="left" w:pos="1320"/>
         </w:tabs>
-      </w:pPr>
-    </w:p>
-    <w:p/>
-    <w:p/>
-    <w:p/>
-    <w:p/>
-    <w:p/>
-    <w:p/>
-    <w:p/>
+        <w:jc w:val="both"/>
+      </w:pPr>
+    </w:p>
+    <w:p>
+      <w:pPr>
+        <w:jc w:val="both"/>
+      </w:pPr>
+    </w:p>
+    <w:p>
+      <w:pPr>
+        <w:jc w:val="both"/>
+      </w:pPr>
+    </w:p>
+    <w:p>
+      <w:pPr>
+        <w:jc w:val="both"/>
+      </w:pPr>
+    </w:p>
+    <w:p>
+      <w:pPr>
+        <w:jc w:val="both"/>
+      </w:pPr>
+    </w:p>
+    <w:p>
+      <w:pPr>
+        <w:jc w:val="both"/>
+      </w:pPr>
+    </w:p>
+    <w:p>
+      <w:pPr>
+        <w:jc w:val="both"/>
+      </w:pPr>
+    </w:p>
+    <w:p>
+      <w:pPr>
+        <w:jc w:val="both"/>
+      </w:pPr>
+    </w:p>
     <w:p>
       <w:pPr>
         <w:pStyle w:val="Titre3"/>
@@ -9331,6 +9676,7 @@
           <w:tab w:val="left" w:pos="990"/>
         </w:tabs>
         <w:ind w:left="360"/>
+        <w:jc w:val="both"/>
       </w:pPr>
       <w:r>
         <w:t>Ces tests valident que l’utilisateur peut se déconnecter de l’application</w:t>
@@ -9360,6 +9706,7 @@
           <w:tab w:val="left" w:pos="990"/>
         </w:tabs>
         <w:ind w:left="360"/>
+        <w:jc w:val="both"/>
       </w:pPr>
       <w:r>
         <w:t>Voici le cas testé :</w:t>
@@ -9375,6 +9722,7 @@
         <w:tabs>
           <w:tab w:val="left" w:pos="990"/>
         </w:tabs>
+        <w:jc w:val="both"/>
       </w:pPr>
       <w:r>
         <w:t>Déconnexion</w:t>
@@ -9385,6 +9733,15 @@
         <w:tabs>
           <w:tab w:val="left" w:pos="990"/>
         </w:tabs>
+        <w:jc w:val="both"/>
+      </w:pPr>
+    </w:p>
+    <w:p>
+      <w:pPr>
+        <w:tabs>
+          <w:tab w:val="left" w:pos="990"/>
+        </w:tabs>
+        <w:jc w:val="both"/>
       </w:pPr>
     </w:p>
     <w:p>
@@ -9422,6 +9779,7 @@
     <w:p>
       <w:pPr>
         <w:ind w:left="708"/>
+        <w:jc w:val="both"/>
       </w:pPr>
       <w:r>
         <w:t xml:space="preserve">Ce test vérifie que l’utilisateur peut </w:t>
@@ -9445,6 +9803,7 @@
     <w:p>
       <w:pPr>
         <w:ind w:left="708"/>
+        <w:jc w:val="both"/>
       </w:pPr>
       <w:r>
         <w:drawing>
@@ -9518,16 +9877,49 @@
         <w:tabs>
           <w:tab w:val="left" w:pos="990"/>
         </w:tabs>
-      </w:pPr>
-    </w:p>
-    <w:p/>
-    <w:p/>
-    <w:p/>
-    <w:p/>
-    <w:p/>
-    <w:p/>
-    <w:p/>
-    <w:p/>
+        <w:jc w:val="both"/>
+      </w:pPr>
+    </w:p>
+    <w:p>
+      <w:pPr>
+        <w:jc w:val="both"/>
+      </w:pPr>
+    </w:p>
+    <w:p>
+      <w:pPr>
+        <w:jc w:val="both"/>
+      </w:pPr>
+    </w:p>
+    <w:p>
+      <w:pPr>
+        <w:jc w:val="both"/>
+      </w:pPr>
+    </w:p>
+    <w:p>
+      <w:pPr>
+        <w:jc w:val="both"/>
+      </w:pPr>
+    </w:p>
+    <w:p>
+      <w:pPr>
+        <w:jc w:val="both"/>
+      </w:pPr>
+    </w:p>
+    <w:p>
+      <w:pPr>
+        <w:jc w:val="both"/>
+      </w:pPr>
+    </w:p>
+    <w:p>
+      <w:pPr>
+        <w:jc w:val="both"/>
+      </w:pPr>
+    </w:p>
+    <w:p>
+      <w:pPr>
+        <w:jc w:val="both"/>
+      </w:pPr>
+    </w:p>
     <w:p>
       <w:pPr>
         <w:pStyle w:val="Titre3"/>
@@ -9552,6 +9944,7 @@
     <w:p>
       <w:pPr>
         <w:ind w:left="708"/>
+        <w:jc w:val="both"/>
       </w:pPr>
       <w:r>
         <w:t xml:space="preserve">Ce test vérifie que l’utilisateur peut supprimer son compte. Cependant, </w:t>
@@ -9566,6 +9959,7 @@
     <w:p>
       <w:pPr>
         <w:ind w:left="708"/>
+        <w:jc w:val="both"/>
       </w:pPr>
       <w:r>
         <w:t>Voici le cas testé :</w:t>
@@ -9578,12 +9972,17 @@
           <w:ilvl w:val="0"/>
           <w:numId w:val="34"/>
         </w:numPr>
+        <w:jc w:val="both"/>
       </w:pPr>
       <w:r>
         <w:t>Suppression de compte</w:t>
       </w:r>
     </w:p>
-    <w:p/>
+    <w:p>
+      <w:pPr>
+        <w:jc w:val="both"/>
+      </w:pPr>
+    </w:p>
     <w:p>
       <w:pPr>
         <w:pStyle w:val="Paragraphedeliste"/>
@@ -9618,6 +10017,7 @@
     <w:p>
       <w:pPr>
         <w:ind w:left="708"/>
+        <w:jc w:val="both"/>
       </w:pPr>
       <w:r>
         <w:t xml:space="preserve">Ce test vérifie que l’utilisateur peut </w:t>
@@ -9646,6 +10046,7 @@
     <w:p>
       <w:pPr>
         <w:ind w:left="708"/>
+        <w:jc w:val="both"/>
       </w:pPr>
       <w:r>
         <w:drawing>
@@ -9705,12 +10106,35 @@
         </w:drawing>
       </w:r>
     </w:p>
-    <w:p/>
-    <w:p/>
-    <w:p/>
-    <w:p/>
-    <w:p/>
-    <w:p>
+    <w:p>
+      <w:pPr>
+        <w:jc w:val="both"/>
+      </w:pPr>
+    </w:p>
+    <w:p>
+      <w:pPr>
+        <w:jc w:val="both"/>
+      </w:pPr>
+    </w:p>
+    <w:p>
+      <w:pPr>
+        <w:jc w:val="both"/>
+      </w:pPr>
+    </w:p>
+    <w:p>
+      <w:pPr>
+        <w:jc w:val="both"/>
+      </w:pPr>
+    </w:p>
+    <w:p>
+      <w:pPr>
+        <w:jc w:val="both"/>
+      </w:pPr>
+    </w:p>
+    <w:p>
+      <w:pPr>
+        <w:jc w:val="both"/>
+      </w:pPr>
       <w:r>
         <w:lastRenderedPageBreak/>
         <w:drawing>
@@ -9770,10 +10194,14 @@
         </w:drawing>
       </w:r>
       <w:r>
-        <w:t xml:space="preserve"> Voici le code en commentaire :</w:t>
-      </w:r>
-    </w:p>
-    <w:p/>
+        <w:t>Voici le code en commentaire :</w:t>
+      </w:r>
+    </w:p>
+    <w:p>
+      <w:pPr>
+        <w:jc w:val="both"/>
+      </w:pPr>
+    </w:p>
     <w:sectPr>
       <w:headerReference w:type="default" r:id="rId54"/>
       <w:headerReference w:type="first" r:id="rId55"/>

</xml_diff>

<commit_message>
doc(Rapport de projet): Rédaction Conclusion et Rapport de test e2e
</commit_message>
<xml_diff>
--- a/WIP/rapport de projet/Rapport de projet test.docx
+++ b/WIP/rapport de projet/Rapport de projet test.docx
@@ -10,7 +10,6 @@
           <w:docPartUnique/>
         </w:docPartObj>
       </w:sdtPr>
-      <w:sdtEndPr/>
       <w:sdtContent>
         <w:p>
           <w:pPr>
@@ -149,7 +148,7 @@
               <w:r>
                 <w:fldChar w:fldCharType="separate"/>
               </w:r>
-              <w:hyperlink w:anchor="_Toc185575451" w:history="1">
+              <w:hyperlink w:anchor="_Toc187043363" w:history="1">
                 <w:r>
                   <w:rPr>
                     <w:rStyle w:val="Lienhypertexte"/>
@@ -193,7 +192,7 @@
                     <w:noProof/>
                     <w:webHidden/>
                   </w:rPr>
-                  <w:instrText xml:space="preserve"> PAGEREF _Toc185575451 \h </w:instrText>
+                  <w:instrText xml:space="preserve"> PAGEREF _Toc187043363 \h </w:instrText>
                 </w:r>
                 <w:r>
                   <w:rPr>
@@ -213,7 +212,7 @@
                     <w:noProof/>
                     <w:webHidden/>
                   </w:rPr>
-                  <w:t>2</w:t>
+                  <w:t>3</w:t>
                 </w:r>
                 <w:r>
                   <w:rPr>
@@ -239,7 +238,7 @@
                   <w14:ligatures w14:val="standardContextual"/>
                 </w:rPr>
               </w:pPr>
-              <w:hyperlink w:anchor="_Toc185575452" w:history="1">
+              <w:hyperlink w:anchor="_Toc187043364" w:history="1">
                 <w:r>
                   <w:rPr>
                     <w:rStyle w:val="Lienhypertexte"/>
@@ -282,7 +281,7 @@
                     <w:noProof/>
                     <w:webHidden/>
                   </w:rPr>
-                  <w:instrText xml:space="preserve"> PAGEREF _Toc185575452 \h </w:instrText>
+                  <w:instrText xml:space="preserve"> PAGEREF _Toc187043364 \h </w:instrText>
                 </w:r>
                 <w:r>
                   <w:rPr>
@@ -302,7 +301,7 @@
                     <w:noProof/>
                     <w:webHidden/>
                   </w:rPr>
-                  <w:t>2</w:t>
+                  <w:t>3</w:t>
                 </w:r>
                 <w:r>
                   <w:rPr>
@@ -328,7 +327,7 @@
                   <w14:ligatures w14:val="standardContextual"/>
                 </w:rPr>
               </w:pPr>
-              <w:hyperlink w:anchor="_Toc185575453" w:history="1">
+              <w:hyperlink w:anchor="_Toc187043365" w:history="1">
                 <w:r>
                   <w:rPr>
                     <w:rStyle w:val="Lienhypertexte"/>
@@ -371,7 +370,7 @@
                     <w:noProof/>
                     <w:webHidden/>
                   </w:rPr>
-                  <w:instrText xml:space="preserve"> PAGEREF _Toc185575453 \h </w:instrText>
+                  <w:instrText xml:space="preserve"> PAGEREF _Toc187043365 \h </w:instrText>
                 </w:r>
                 <w:r>
                   <w:rPr>
@@ -391,7 +390,7 @@
                     <w:noProof/>
                     <w:webHidden/>
                   </w:rPr>
-                  <w:t>2</w:t>
+                  <w:t>3</w:t>
                 </w:r>
                 <w:r>
                   <w:rPr>
@@ -417,7 +416,7 @@
                   <w14:ligatures w14:val="standardContextual"/>
                 </w:rPr>
               </w:pPr>
-              <w:hyperlink w:anchor="_Toc185575454" w:history="1">
+              <w:hyperlink w:anchor="_Toc187043366" w:history="1">
                 <w:r>
                   <w:rPr>
                     <w:rStyle w:val="Lienhypertexte"/>
@@ -460,7 +459,7 @@
                     <w:noProof/>
                     <w:webHidden/>
                   </w:rPr>
-                  <w:instrText xml:space="preserve"> PAGEREF _Toc185575454 \h </w:instrText>
+                  <w:instrText xml:space="preserve"> PAGEREF _Toc187043366 \h </w:instrText>
                 </w:r>
                 <w:r>
                   <w:rPr>
@@ -480,7 +479,7 @@
                     <w:noProof/>
                     <w:webHidden/>
                   </w:rPr>
-                  <w:t>2</w:t>
+                  <w:t>3</w:t>
                 </w:r>
                 <w:r>
                   <w:rPr>
@@ -506,7 +505,7 @@
                   <w14:ligatures w14:val="standardContextual"/>
                 </w:rPr>
               </w:pPr>
-              <w:hyperlink w:anchor="_Toc185575455" w:history="1">
+              <w:hyperlink w:anchor="_Toc187043367" w:history="1">
                 <w:r>
                   <w:rPr>
                     <w:rStyle w:val="Lienhypertexte"/>
@@ -549,7 +548,7 @@
                     <w:noProof/>
                     <w:webHidden/>
                   </w:rPr>
-                  <w:instrText xml:space="preserve"> PAGEREF _Toc185575455 \h </w:instrText>
+                  <w:instrText xml:space="preserve"> PAGEREF _Toc187043367 \h </w:instrText>
                 </w:r>
                 <w:r>
                   <w:rPr>
@@ -569,7 +568,7 @@
                     <w:noProof/>
                     <w:webHidden/>
                   </w:rPr>
-                  <w:t>2</w:t>
+                  <w:t>3</w:t>
                 </w:r>
                 <w:r>
                   <w:rPr>
@@ -595,7 +594,7 @@
                   <w14:ligatures w14:val="standardContextual"/>
                 </w:rPr>
               </w:pPr>
-              <w:hyperlink w:anchor="_Toc185575456" w:history="1">
+              <w:hyperlink w:anchor="_Toc187043368" w:history="1">
                 <w:r>
                   <w:rPr>
                     <w:rStyle w:val="Lienhypertexte"/>
@@ -639,7 +638,7 @@
                     <w:noProof/>
                     <w:webHidden/>
                   </w:rPr>
-                  <w:instrText xml:space="preserve"> PAGEREF _Toc185575456 \h </w:instrText>
+                  <w:instrText xml:space="preserve"> PAGEREF _Toc187043368 \h </w:instrText>
                 </w:r>
                 <w:r>
                   <w:rPr>
@@ -659,7 +658,7 @@
                     <w:noProof/>
                     <w:webHidden/>
                   </w:rPr>
-                  <w:t>3</w:t>
+                  <w:t>4</w:t>
                 </w:r>
                 <w:r>
                   <w:rPr>
@@ -685,7 +684,7 @@
                   <w14:ligatures w14:val="standardContextual"/>
                 </w:rPr>
               </w:pPr>
-              <w:hyperlink w:anchor="_Toc185575457" w:history="1">
+              <w:hyperlink w:anchor="_Toc187043369" w:history="1">
                 <w:r>
                   <w:rPr>
                     <w:rStyle w:val="Lienhypertexte"/>
@@ -728,7 +727,7 @@
                     <w:noProof/>
                     <w:webHidden/>
                   </w:rPr>
-                  <w:instrText xml:space="preserve"> PAGEREF _Toc185575457 \h </w:instrText>
+                  <w:instrText xml:space="preserve"> PAGEREF _Toc187043369 \h </w:instrText>
                 </w:r>
                 <w:r>
                   <w:rPr>
@@ -748,7 +747,7 @@
                     <w:noProof/>
                     <w:webHidden/>
                   </w:rPr>
-                  <w:t>3</w:t>
+                  <w:t>4</w:t>
                 </w:r>
                 <w:r>
                   <w:rPr>
@@ -774,7 +773,7 @@
                   <w14:ligatures w14:val="standardContextual"/>
                 </w:rPr>
               </w:pPr>
-              <w:hyperlink w:anchor="_Toc185575458" w:history="1">
+              <w:hyperlink w:anchor="_Toc187043370" w:history="1">
                 <w:r>
                   <w:rPr>
                     <w:rStyle w:val="Lienhypertexte"/>
@@ -817,7 +816,7 @@
                     <w:noProof/>
                     <w:webHidden/>
                   </w:rPr>
-                  <w:instrText xml:space="preserve"> PAGEREF _Toc185575458 \h </w:instrText>
+                  <w:instrText xml:space="preserve"> PAGEREF _Toc187043370 \h </w:instrText>
                 </w:r>
                 <w:r>
                   <w:rPr>
@@ -837,7 +836,7 @@
                     <w:noProof/>
                     <w:webHidden/>
                   </w:rPr>
-                  <w:t>4</w:t>
+                  <w:t>5</w:t>
                 </w:r>
                 <w:r>
                   <w:rPr>
@@ -863,7 +862,7 @@
                   <w14:ligatures w14:val="standardContextual"/>
                 </w:rPr>
               </w:pPr>
-              <w:hyperlink w:anchor="_Toc185575459" w:history="1">
+              <w:hyperlink w:anchor="_Toc187043371" w:history="1">
                 <w:r>
                   <w:rPr>
                     <w:rStyle w:val="Lienhypertexte"/>
@@ -906,7 +905,7 @@
                     <w:noProof/>
                     <w:webHidden/>
                   </w:rPr>
-                  <w:instrText xml:space="preserve"> PAGEREF _Toc185575459 \h </w:instrText>
+                  <w:instrText xml:space="preserve"> PAGEREF _Toc187043371 \h </w:instrText>
                 </w:r>
                 <w:r>
                   <w:rPr>
@@ -926,7 +925,1164 @@
                     <w:noProof/>
                     <w:webHidden/>
                   </w:rPr>
-                  <w:t>5</w:t>
+                  <w:t>6</w:t>
+                </w:r>
+                <w:r>
+                  <w:rPr>
+                    <w:noProof/>
+                    <w:webHidden/>
+                  </w:rPr>
+                  <w:fldChar w:fldCharType="end"/>
+                </w:r>
+              </w:hyperlink>
+            </w:p>
+            <w:p>
+              <w:pPr>
+                <w:pStyle w:val="TM2"/>
+                <w:tabs>
+                  <w:tab w:val="left" w:pos="880"/>
+                  <w:tab w:val="right" w:leader="dot" w:pos="9062"/>
+                </w:tabs>
+                <w:jc w:val="both"/>
+                <w:rPr>
+                  <w:rFonts w:cstheme="minorBidi"/>
+                  <w:noProof/>
+                  <w:kern w:val="2"/>
+                  <w14:ligatures w14:val="standardContextual"/>
+                </w:rPr>
+              </w:pPr>
+              <w:hyperlink w:anchor="_Toc187043372" w:history="1">
+                <w:r>
+                  <w:rPr>
+                    <w:rStyle w:val="Lienhypertexte"/>
+                    <w:noProof/>
+                  </w:rPr>
+                  <w:t>2.4</w:t>
+                </w:r>
+                <w:r>
+                  <w:rPr>
+                    <w:rFonts w:cstheme="minorBidi"/>
+                    <w:noProof/>
+                    <w:kern w:val="2"/>
+                    <w14:ligatures w14:val="standardContextual"/>
+                  </w:rPr>
+                  <w:tab/>
+                </w:r>
+                <w:r>
+                  <w:rPr>
+                    <w:rStyle w:val="Lienhypertexte"/>
+                    <w:noProof/>
+                  </w:rPr>
+                  <w:t>Test Backend</w:t>
+                </w:r>
+                <w:r>
+                  <w:rPr>
+                    <w:noProof/>
+                    <w:webHidden/>
+                  </w:rPr>
+                  <w:tab/>
+                </w:r>
+                <w:r>
+                  <w:rPr>
+                    <w:noProof/>
+                    <w:webHidden/>
+                  </w:rPr>
+                  <w:fldChar w:fldCharType="begin"/>
+                </w:r>
+                <w:r>
+                  <w:rPr>
+                    <w:noProof/>
+                    <w:webHidden/>
+                  </w:rPr>
+                  <w:instrText xml:space="preserve"> PAGEREF _Toc187043372 \h </w:instrText>
+                </w:r>
+                <w:r>
+                  <w:rPr>
+                    <w:noProof/>
+                    <w:webHidden/>
+                  </w:rPr>
+                </w:r>
+                <w:r>
+                  <w:rPr>
+                    <w:noProof/>
+                    <w:webHidden/>
+                  </w:rPr>
+                  <w:fldChar w:fldCharType="separate"/>
+                </w:r>
+                <w:r>
+                  <w:rPr>
+                    <w:noProof/>
+                    <w:webHidden/>
+                  </w:rPr>
+                  <w:t>8</w:t>
+                </w:r>
+                <w:r>
+                  <w:rPr>
+                    <w:noProof/>
+                    <w:webHidden/>
+                  </w:rPr>
+                  <w:fldChar w:fldCharType="end"/>
+                </w:r>
+              </w:hyperlink>
+            </w:p>
+            <w:p>
+              <w:pPr>
+                <w:pStyle w:val="TM3"/>
+                <w:tabs>
+                  <w:tab w:val="left" w:pos="1320"/>
+                  <w:tab w:val="right" w:leader="dot" w:pos="9062"/>
+                </w:tabs>
+                <w:jc w:val="both"/>
+                <w:rPr>
+                  <w:rFonts w:cstheme="minorBidi"/>
+                  <w:noProof/>
+                  <w:kern w:val="2"/>
+                  <w14:ligatures w14:val="standardContextual"/>
+                </w:rPr>
+              </w:pPr>
+              <w:hyperlink w:anchor="_Toc187043373" w:history="1">
+                <w:r>
+                  <w:rPr>
+                    <w:rStyle w:val="Lienhypertexte"/>
+                    <w:noProof/>
+                  </w:rPr>
+                  <w:t>2.4.1</w:t>
+                </w:r>
+                <w:r>
+                  <w:rPr>
+                    <w:rFonts w:cstheme="minorBidi"/>
+                    <w:noProof/>
+                    <w:kern w:val="2"/>
+                    <w14:ligatures w14:val="standardContextual"/>
+                  </w:rPr>
+                  <w:tab/>
+                </w:r>
+                <w:r>
+                  <w:rPr>
+                    <w:rStyle w:val="Lienhypertexte"/>
+                    <w:noProof/>
+                  </w:rPr>
+                  <w:t>Authentification</w:t>
+                </w:r>
+                <w:r>
+                  <w:rPr>
+                    <w:noProof/>
+                    <w:webHidden/>
+                  </w:rPr>
+                  <w:tab/>
+                </w:r>
+                <w:r>
+                  <w:rPr>
+                    <w:noProof/>
+                    <w:webHidden/>
+                  </w:rPr>
+                  <w:fldChar w:fldCharType="begin"/>
+                </w:r>
+                <w:r>
+                  <w:rPr>
+                    <w:noProof/>
+                    <w:webHidden/>
+                  </w:rPr>
+                  <w:instrText xml:space="preserve"> PAGEREF _Toc187043373 \h </w:instrText>
+                </w:r>
+                <w:r>
+                  <w:rPr>
+                    <w:noProof/>
+                    <w:webHidden/>
+                  </w:rPr>
+                </w:r>
+                <w:r>
+                  <w:rPr>
+                    <w:noProof/>
+                    <w:webHidden/>
+                  </w:rPr>
+                  <w:fldChar w:fldCharType="separate"/>
+                </w:r>
+                <w:r>
+                  <w:rPr>
+                    <w:noProof/>
+                    <w:webHidden/>
+                  </w:rPr>
+                  <w:t>8</w:t>
+                </w:r>
+                <w:r>
+                  <w:rPr>
+                    <w:noProof/>
+                    <w:webHidden/>
+                  </w:rPr>
+                  <w:fldChar w:fldCharType="end"/>
+                </w:r>
+              </w:hyperlink>
+            </w:p>
+            <w:p>
+              <w:pPr>
+                <w:pStyle w:val="TM3"/>
+                <w:tabs>
+                  <w:tab w:val="left" w:pos="1320"/>
+                  <w:tab w:val="right" w:leader="dot" w:pos="9062"/>
+                </w:tabs>
+                <w:jc w:val="both"/>
+                <w:rPr>
+                  <w:rFonts w:cstheme="minorBidi"/>
+                  <w:noProof/>
+                  <w:kern w:val="2"/>
+                  <w14:ligatures w14:val="standardContextual"/>
+                </w:rPr>
+              </w:pPr>
+              <w:hyperlink w:anchor="_Toc187043374" w:history="1">
+                <w:r>
+                  <w:rPr>
+                    <w:rStyle w:val="Lienhypertexte"/>
+                    <w:noProof/>
+                  </w:rPr>
+                  <w:t>2.4.2</w:t>
+                </w:r>
+                <w:r>
+                  <w:rPr>
+                    <w:rFonts w:cstheme="minorBidi"/>
+                    <w:noProof/>
+                    <w:kern w:val="2"/>
+                    <w14:ligatures w14:val="standardContextual"/>
+                  </w:rPr>
+                  <w:tab/>
+                </w:r>
+                <w:r>
+                  <w:rPr>
+                    <w:rStyle w:val="Lienhypertexte"/>
+                    <w:noProof/>
+                  </w:rPr>
+                  <w:t>Test Login</w:t>
+                </w:r>
+                <w:r>
+                  <w:rPr>
+                    <w:noProof/>
+                    <w:webHidden/>
+                  </w:rPr>
+                  <w:tab/>
+                </w:r>
+                <w:r>
+                  <w:rPr>
+                    <w:noProof/>
+                    <w:webHidden/>
+                  </w:rPr>
+                  <w:fldChar w:fldCharType="begin"/>
+                </w:r>
+                <w:r>
+                  <w:rPr>
+                    <w:noProof/>
+                    <w:webHidden/>
+                  </w:rPr>
+                  <w:instrText xml:space="preserve"> PAGEREF _Toc187043374 \h </w:instrText>
+                </w:r>
+                <w:r>
+                  <w:rPr>
+                    <w:noProof/>
+                    <w:webHidden/>
+                  </w:rPr>
+                </w:r>
+                <w:r>
+                  <w:rPr>
+                    <w:noProof/>
+                    <w:webHidden/>
+                  </w:rPr>
+                  <w:fldChar w:fldCharType="separate"/>
+                </w:r>
+                <w:r>
+                  <w:rPr>
+                    <w:noProof/>
+                    <w:webHidden/>
+                  </w:rPr>
+                  <w:t>9</w:t>
+                </w:r>
+                <w:r>
+                  <w:rPr>
+                    <w:noProof/>
+                    <w:webHidden/>
+                  </w:rPr>
+                  <w:fldChar w:fldCharType="end"/>
+                </w:r>
+              </w:hyperlink>
+            </w:p>
+            <w:p>
+              <w:pPr>
+                <w:pStyle w:val="TM3"/>
+                <w:tabs>
+                  <w:tab w:val="left" w:pos="1320"/>
+                  <w:tab w:val="right" w:leader="dot" w:pos="9062"/>
+                </w:tabs>
+                <w:jc w:val="both"/>
+                <w:rPr>
+                  <w:rFonts w:cstheme="minorBidi"/>
+                  <w:noProof/>
+                  <w:kern w:val="2"/>
+                  <w14:ligatures w14:val="standardContextual"/>
+                </w:rPr>
+              </w:pPr>
+              <w:hyperlink w:anchor="_Toc187043375" w:history="1">
+                <w:r>
+                  <w:rPr>
+                    <w:rStyle w:val="Lienhypertexte"/>
+                    <w:noProof/>
+                  </w:rPr>
+                  <w:t>2.4.3</w:t>
+                </w:r>
+                <w:r>
+                  <w:rPr>
+                    <w:rFonts w:cstheme="minorBidi"/>
+                    <w:noProof/>
+                    <w:kern w:val="2"/>
+                    <w14:ligatures w14:val="standardContextual"/>
+                  </w:rPr>
+                  <w:tab/>
+                </w:r>
+                <w:r>
+                  <w:rPr>
+                    <w:rStyle w:val="Lienhypertexte"/>
+                    <w:noProof/>
+                  </w:rPr>
+                  <w:t>Gestion de l’utilisateur</w:t>
+                </w:r>
+                <w:r>
+                  <w:rPr>
+                    <w:noProof/>
+                    <w:webHidden/>
+                  </w:rPr>
+                  <w:tab/>
+                </w:r>
+                <w:r>
+                  <w:rPr>
+                    <w:noProof/>
+                    <w:webHidden/>
+                  </w:rPr>
+                  <w:fldChar w:fldCharType="begin"/>
+                </w:r>
+                <w:r>
+                  <w:rPr>
+                    <w:noProof/>
+                    <w:webHidden/>
+                  </w:rPr>
+                  <w:instrText xml:space="preserve"> PAGEREF _Toc187043375 \h </w:instrText>
+                </w:r>
+                <w:r>
+                  <w:rPr>
+                    <w:noProof/>
+                    <w:webHidden/>
+                  </w:rPr>
+                </w:r>
+                <w:r>
+                  <w:rPr>
+                    <w:noProof/>
+                    <w:webHidden/>
+                  </w:rPr>
+                  <w:fldChar w:fldCharType="separate"/>
+                </w:r>
+                <w:r>
+                  <w:rPr>
+                    <w:noProof/>
+                    <w:webHidden/>
+                  </w:rPr>
+                  <w:t>12</w:t>
+                </w:r>
+                <w:r>
+                  <w:rPr>
+                    <w:noProof/>
+                    <w:webHidden/>
+                  </w:rPr>
+                  <w:fldChar w:fldCharType="end"/>
+                </w:r>
+              </w:hyperlink>
+            </w:p>
+            <w:p>
+              <w:pPr>
+                <w:pStyle w:val="TM2"/>
+                <w:tabs>
+                  <w:tab w:val="left" w:pos="880"/>
+                  <w:tab w:val="right" w:leader="dot" w:pos="9062"/>
+                </w:tabs>
+                <w:jc w:val="both"/>
+                <w:rPr>
+                  <w:rFonts w:cstheme="minorBidi"/>
+                  <w:noProof/>
+                  <w:kern w:val="2"/>
+                  <w14:ligatures w14:val="standardContextual"/>
+                </w:rPr>
+              </w:pPr>
+              <w:hyperlink w:anchor="_Toc187043376" w:history="1">
+                <w:r>
+                  <w:rPr>
+                    <w:rStyle w:val="Lienhypertexte"/>
+                    <w:noProof/>
+                  </w:rPr>
+                  <w:t>2.5</w:t>
+                </w:r>
+                <w:r>
+                  <w:rPr>
+                    <w:rFonts w:cstheme="minorBidi"/>
+                    <w:noProof/>
+                    <w:kern w:val="2"/>
+                    <w14:ligatures w14:val="standardContextual"/>
+                  </w:rPr>
+                  <w:tab/>
+                </w:r>
+                <w:r>
+                  <w:rPr>
+                    <w:rStyle w:val="Lienhypertexte"/>
+                    <w:noProof/>
+                  </w:rPr>
+                  <w:t>Test E2E</w:t>
+                </w:r>
+                <w:r>
+                  <w:rPr>
+                    <w:noProof/>
+                    <w:webHidden/>
+                  </w:rPr>
+                  <w:tab/>
+                </w:r>
+                <w:r>
+                  <w:rPr>
+                    <w:noProof/>
+                    <w:webHidden/>
+                  </w:rPr>
+                  <w:fldChar w:fldCharType="begin"/>
+                </w:r>
+                <w:r>
+                  <w:rPr>
+                    <w:noProof/>
+                    <w:webHidden/>
+                  </w:rPr>
+                  <w:instrText xml:space="preserve"> PAGEREF _Toc187043376 \h </w:instrText>
+                </w:r>
+                <w:r>
+                  <w:rPr>
+                    <w:noProof/>
+                    <w:webHidden/>
+                  </w:rPr>
+                </w:r>
+                <w:r>
+                  <w:rPr>
+                    <w:noProof/>
+                    <w:webHidden/>
+                  </w:rPr>
+                  <w:fldChar w:fldCharType="separate"/>
+                </w:r>
+                <w:r>
+                  <w:rPr>
+                    <w:noProof/>
+                    <w:webHidden/>
+                  </w:rPr>
+                  <w:t>14</w:t>
+                </w:r>
+                <w:r>
+                  <w:rPr>
+                    <w:noProof/>
+                    <w:webHidden/>
+                  </w:rPr>
+                  <w:fldChar w:fldCharType="end"/>
+                </w:r>
+              </w:hyperlink>
+            </w:p>
+            <w:p>
+              <w:pPr>
+                <w:pStyle w:val="TM3"/>
+                <w:tabs>
+                  <w:tab w:val="left" w:pos="1320"/>
+                  <w:tab w:val="right" w:leader="dot" w:pos="9062"/>
+                </w:tabs>
+                <w:jc w:val="both"/>
+                <w:rPr>
+                  <w:rFonts w:cstheme="minorBidi"/>
+                  <w:noProof/>
+                  <w:kern w:val="2"/>
+                  <w14:ligatures w14:val="standardContextual"/>
+                </w:rPr>
+              </w:pPr>
+              <w:hyperlink w:anchor="_Toc187043377" w:history="1">
+                <w:r>
+                  <w:rPr>
+                    <w:rStyle w:val="Lienhypertexte"/>
+                    <w:noProof/>
+                  </w:rPr>
+                  <w:t>2.5.1</w:t>
+                </w:r>
+                <w:r>
+                  <w:rPr>
+                    <w:rFonts w:cstheme="minorBidi"/>
+                    <w:noProof/>
+                    <w:kern w:val="2"/>
+                    <w14:ligatures w14:val="standardContextual"/>
+                  </w:rPr>
+                  <w:tab/>
+                </w:r>
+                <w:r>
+                  <w:rPr>
+                    <w:rStyle w:val="Lienhypertexte"/>
+                    <w:noProof/>
+                  </w:rPr>
+                  <w:t>Détails globaux</w:t>
+                </w:r>
+                <w:r>
+                  <w:rPr>
+                    <w:noProof/>
+                    <w:webHidden/>
+                  </w:rPr>
+                  <w:tab/>
+                </w:r>
+                <w:r>
+                  <w:rPr>
+                    <w:noProof/>
+                    <w:webHidden/>
+                  </w:rPr>
+                  <w:fldChar w:fldCharType="begin"/>
+                </w:r>
+                <w:r>
+                  <w:rPr>
+                    <w:noProof/>
+                    <w:webHidden/>
+                  </w:rPr>
+                  <w:instrText xml:space="preserve"> PAGEREF _Toc187043377 \h </w:instrText>
+                </w:r>
+                <w:r>
+                  <w:rPr>
+                    <w:noProof/>
+                    <w:webHidden/>
+                  </w:rPr>
+                </w:r>
+                <w:r>
+                  <w:rPr>
+                    <w:noProof/>
+                    <w:webHidden/>
+                  </w:rPr>
+                  <w:fldChar w:fldCharType="separate"/>
+                </w:r>
+                <w:r>
+                  <w:rPr>
+                    <w:noProof/>
+                    <w:webHidden/>
+                  </w:rPr>
+                  <w:t>14</w:t>
+                </w:r>
+                <w:r>
+                  <w:rPr>
+                    <w:noProof/>
+                    <w:webHidden/>
+                  </w:rPr>
+                  <w:fldChar w:fldCharType="end"/>
+                </w:r>
+              </w:hyperlink>
+            </w:p>
+            <w:p>
+              <w:pPr>
+                <w:pStyle w:val="TM3"/>
+                <w:tabs>
+                  <w:tab w:val="left" w:pos="1320"/>
+                  <w:tab w:val="right" w:leader="dot" w:pos="9062"/>
+                </w:tabs>
+                <w:jc w:val="both"/>
+                <w:rPr>
+                  <w:rFonts w:cstheme="minorBidi"/>
+                  <w:noProof/>
+                  <w:kern w:val="2"/>
+                  <w14:ligatures w14:val="standardContextual"/>
+                </w:rPr>
+              </w:pPr>
+              <w:hyperlink w:anchor="_Toc187043378" w:history="1">
+                <w:r>
+                  <w:rPr>
+                    <w:rStyle w:val="Lienhypertexte"/>
+                    <w:noProof/>
+                  </w:rPr>
+                  <w:t>2.5.2</w:t>
+                </w:r>
+                <w:r>
+                  <w:rPr>
+                    <w:rFonts w:cstheme="minorBidi"/>
+                    <w:noProof/>
+                    <w:kern w:val="2"/>
+                    <w14:ligatures w14:val="standardContextual"/>
+                  </w:rPr>
+                  <w:tab/>
+                </w:r>
+                <w:r>
+                  <w:rPr>
+                    <w:rStyle w:val="Lienhypertexte"/>
+                    <w:noProof/>
+                  </w:rPr>
+                  <w:t>Création de compte</w:t>
+                </w:r>
+                <w:r>
+                  <w:rPr>
+                    <w:noProof/>
+                    <w:webHidden/>
+                  </w:rPr>
+                  <w:tab/>
+                </w:r>
+                <w:r>
+                  <w:rPr>
+                    <w:noProof/>
+                    <w:webHidden/>
+                  </w:rPr>
+                  <w:fldChar w:fldCharType="begin"/>
+                </w:r>
+                <w:r>
+                  <w:rPr>
+                    <w:noProof/>
+                    <w:webHidden/>
+                  </w:rPr>
+                  <w:instrText xml:space="preserve"> PAGEREF _Toc187043378 \h </w:instrText>
+                </w:r>
+                <w:r>
+                  <w:rPr>
+                    <w:noProof/>
+                    <w:webHidden/>
+                  </w:rPr>
+                </w:r>
+                <w:r>
+                  <w:rPr>
+                    <w:noProof/>
+                    <w:webHidden/>
+                  </w:rPr>
+                  <w:fldChar w:fldCharType="separate"/>
+                </w:r>
+                <w:r>
+                  <w:rPr>
+                    <w:noProof/>
+                    <w:webHidden/>
+                  </w:rPr>
+                  <w:t>14</w:t>
+                </w:r>
+                <w:r>
+                  <w:rPr>
+                    <w:noProof/>
+                    <w:webHidden/>
+                  </w:rPr>
+                  <w:fldChar w:fldCharType="end"/>
+                </w:r>
+              </w:hyperlink>
+            </w:p>
+            <w:p>
+              <w:pPr>
+                <w:pStyle w:val="TM3"/>
+                <w:tabs>
+                  <w:tab w:val="left" w:pos="1320"/>
+                  <w:tab w:val="right" w:leader="dot" w:pos="9062"/>
+                </w:tabs>
+                <w:jc w:val="both"/>
+                <w:rPr>
+                  <w:rFonts w:cstheme="minorBidi"/>
+                  <w:noProof/>
+                  <w:kern w:val="2"/>
+                  <w14:ligatures w14:val="standardContextual"/>
+                </w:rPr>
+              </w:pPr>
+              <w:hyperlink w:anchor="_Toc187043379" w:history="1">
+                <w:r>
+                  <w:rPr>
+                    <w:rStyle w:val="Lienhypertexte"/>
+                    <w:noProof/>
+                  </w:rPr>
+                  <w:t>2.5.3</w:t>
+                </w:r>
+                <w:r>
+                  <w:rPr>
+                    <w:rFonts w:cstheme="minorBidi"/>
+                    <w:noProof/>
+                    <w:kern w:val="2"/>
+                    <w14:ligatures w14:val="standardContextual"/>
+                  </w:rPr>
+                  <w:tab/>
+                </w:r>
+                <w:r>
+                  <w:rPr>
+                    <w:rStyle w:val="Lienhypertexte"/>
+                    <w:noProof/>
+                  </w:rPr>
+                  <w:t>Connexion</w:t>
+                </w:r>
+                <w:r>
+                  <w:rPr>
+                    <w:noProof/>
+                    <w:webHidden/>
+                  </w:rPr>
+                  <w:tab/>
+                </w:r>
+                <w:r>
+                  <w:rPr>
+                    <w:noProof/>
+                    <w:webHidden/>
+                  </w:rPr>
+                  <w:fldChar w:fldCharType="begin"/>
+                </w:r>
+                <w:r>
+                  <w:rPr>
+                    <w:noProof/>
+                    <w:webHidden/>
+                  </w:rPr>
+                  <w:instrText xml:space="preserve"> PAGEREF _Toc187043379 \h </w:instrText>
+                </w:r>
+                <w:r>
+                  <w:rPr>
+                    <w:noProof/>
+                    <w:webHidden/>
+                  </w:rPr>
+                </w:r>
+                <w:r>
+                  <w:rPr>
+                    <w:noProof/>
+                    <w:webHidden/>
+                  </w:rPr>
+                  <w:fldChar w:fldCharType="separate"/>
+                </w:r>
+                <w:r>
+                  <w:rPr>
+                    <w:noProof/>
+                    <w:webHidden/>
+                  </w:rPr>
+                  <w:t>17</w:t>
+                </w:r>
+                <w:r>
+                  <w:rPr>
+                    <w:noProof/>
+                    <w:webHidden/>
+                  </w:rPr>
+                  <w:fldChar w:fldCharType="end"/>
+                </w:r>
+              </w:hyperlink>
+            </w:p>
+            <w:p>
+              <w:pPr>
+                <w:pStyle w:val="TM3"/>
+                <w:tabs>
+                  <w:tab w:val="left" w:pos="1320"/>
+                  <w:tab w:val="right" w:leader="dot" w:pos="9062"/>
+                </w:tabs>
+                <w:jc w:val="both"/>
+                <w:rPr>
+                  <w:rFonts w:cstheme="minorBidi"/>
+                  <w:noProof/>
+                  <w:kern w:val="2"/>
+                  <w14:ligatures w14:val="standardContextual"/>
+                </w:rPr>
+              </w:pPr>
+              <w:hyperlink w:anchor="_Toc187043380" w:history="1">
+                <w:r>
+                  <w:rPr>
+                    <w:rStyle w:val="Lienhypertexte"/>
+                    <w:noProof/>
+                  </w:rPr>
+                  <w:t>2.5.4</w:t>
+                </w:r>
+                <w:r>
+                  <w:rPr>
+                    <w:rFonts w:cstheme="minorBidi"/>
+                    <w:noProof/>
+                    <w:kern w:val="2"/>
+                    <w14:ligatures w14:val="standardContextual"/>
+                  </w:rPr>
+                  <w:tab/>
+                </w:r>
+                <w:r>
+                  <w:rPr>
+                    <w:rStyle w:val="Lienhypertexte"/>
+                    <w:noProof/>
+                  </w:rPr>
+                  <w:t>Gestion du profil</w:t>
+                </w:r>
+                <w:r>
+                  <w:rPr>
+                    <w:noProof/>
+                    <w:webHidden/>
+                  </w:rPr>
+                  <w:tab/>
+                </w:r>
+                <w:r>
+                  <w:rPr>
+                    <w:noProof/>
+                    <w:webHidden/>
+                  </w:rPr>
+                  <w:fldChar w:fldCharType="begin"/>
+                </w:r>
+                <w:r>
+                  <w:rPr>
+                    <w:noProof/>
+                    <w:webHidden/>
+                  </w:rPr>
+                  <w:instrText xml:space="preserve"> PAGEREF _Toc187043380 \h </w:instrText>
+                </w:r>
+                <w:r>
+                  <w:rPr>
+                    <w:noProof/>
+                    <w:webHidden/>
+                  </w:rPr>
+                </w:r>
+                <w:r>
+                  <w:rPr>
+                    <w:noProof/>
+                    <w:webHidden/>
+                  </w:rPr>
+                  <w:fldChar w:fldCharType="separate"/>
+                </w:r>
+                <w:r>
+                  <w:rPr>
+                    <w:noProof/>
+                    <w:webHidden/>
+                  </w:rPr>
+                  <w:t>19</w:t>
+                </w:r>
+                <w:r>
+                  <w:rPr>
+                    <w:noProof/>
+                    <w:webHidden/>
+                  </w:rPr>
+                  <w:fldChar w:fldCharType="end"/>
+                </w:r>
+              </w:hyperlink>
+            </w:p>
+            <w:p>
+              <w:pPr>
+                <w:pStyle w:val="TM3"/>
+                <w:tabs>
+                  <w:tab w:val="left" w:pos="1320"/>
+                  <w:tab w:val="right" w:leader="dot" w:pos="9062"/>
+                </w:tabs>
+                <w:jc w:val="both"/>
+                <w:rPr>
+                  <w:rFonts w:cstheme="minorBidi"/>
+                  <w:noProof/>
+                  <w:kern w:val="2"/>
+                  <w14:ligatures w14:val="standardContextual"/>
+                </w:rPr>
+              </w:pPr>
+              <w:hyperlink w:anchor="_Toc187043381" w:history="1">
+                <w:r>
+                  <w:rPr>
+                    <w:rStyle w:val="Lienhypertexte"/>
+                    <w:noProof/>
+                  </w:rPr>
+                  <w:t>2.5.5</w:t>
+                </w:r>
+                <w:r>
+                  <w:rPr>
+                    <w:rFonts w:cstheme="minorBidi"/>
+                    <w:noProof/>
+                    <w:kern w:val="2"/>
+                    <w14:ligatures w14:val="standardContextual"/>
+                  </w:rPr>
+                  <w:tab/>
+                </w:r>
+                <w:r>
+                  <w:rPr>
+                    <w:rStyle w:val="Lienhypertexte"/>
+                    <w:noProof/>
+                  </w:rPr>
+                  <w:t>Gestion des tâches</w:t>
+                </w:r>
+                <w:r>
+                  <w:rPr>
+                    <w:noProof/>
+                    <w:webHidden/>
+                  </w:rPr>
+                  <w:tab/>
+                </w:r>
+                <w:r>
+                  <w:rPr>
+                    <w:noProof/>
+                    <w:webHidden/>
+                  </w:rPr>
+                  <w:fldChar w:fldCharType="begin"/>
+                </w:r>
+                <w:r>
+                  <w:rPr>
+                    <w:noProof/>
+                    <w:webHidden/>
+                  </w:rPr>
+                  <w:instrText xml:space="preserve"> PAGEREF _Toc187043381 \h </w:instrText>
+                </w:r>
+                <w:r>
+                  <w:rPr>
+                    <w:noProof/>
+                    <w:webHidden/>
+                  </w:rPr>
+                </w:r>
+                <w:r>
+                  <w:rPr>
+                    <w:noProof/>
+                    <w:webHidden/>
+                  </w:rPr>
+                  <w:fldChar w:fldCharType="separate"/>
+                </w:r>
+                <w:r>
+                  <w:rPr>
+                    <w:noProof/>
+                    <w:webHidden/>
+                  </w:rPr>
+                  <w:t>21</w:t>
+                </w:r>
+                <w:r>
+                  <w:rPr>
+                    <w:noProof/>
+                    <w:webHidden/>
+                  </w:rPr>
+                  <w:fldChar w:fldCharType="end"/>
+                </w:r>
+              </w:hyperlink>
+            </w:p>
+            <w:p>
+              <w:pPr>
+                <w:pStyle w:val="TM3"/>
+                <w:tabs>
+                  <w:tab w:val="left" w:pos="1320"/>
+                  <w:tab w:val="right" w:leader="dot" w:pos="9062"/>
+                </w:tabs>
+                <w:jc w:val="both"/>
+                <w:rPr>
+                  <w:rFonts w:cstheme="minorBidi"/>
+                  <w:noProof/>
+                  <w:kern w:val="2"/>
+                  <w14:ligatures w14:val="standardContextual"/>
+                </w:rPr>
+              </w:pPr>
+              <w:hyperlink w:anchor="_Toc187043382" w:history="1">
+                <w:r>
+                  <w:rPr>
+                    <w:rStyle w:val="Lienhypertexte"/>
+                    <w:noProof/>
+                  </w:rPr>
+                  <w:t>2.5.6</w:t>
+                </w:r>
+                <w:r>
+                  <w:rPr>
+                    <w:rFonts w:cstheme="minorBidi"/>
+                    <w:noProof/>
+                    <w:kern w:val="2"/>
+                    <w14:ligatures w14:val="standardContextual"/>
+                  </w:rPr>
+                  <w:tab/>
+                </w:r>
+                <w:r>
+                  <w:rPr>
+                    <w:rStyle w:val="Lienhypertexte"/>
+                    <w:noProof/>
+                  </w:rPr>
+                  <w:t>Navigation</w:t>
+                </w:r>
+                <w:r>
+                  <w:rPr>
+                    <w:noProof/>
+                    <w:webHidden/>
+                  </w:rPr>
+                  <w:tab/>
+                </w:r>
+                <w:r>
+                  <w:rPr>
+                    <w:noProof/>
+                    <w:webHidden/>
+                  </w:rPr>
+                  <w:fldChar w:fldCharType="begin"/>
+                </w:r>
+                <w:r>
+                  <w:rPr>
+                    <w:noProof/>
+                    <w:webHidden/>
+                  </w:rPr>
+                  <w:instrText xml:space="preserve"> PAGEREF _Toc187043382 \h </w:instrText>
+                </w:r>
+                <w:r>
+                  <w:rPr>
+                    <w:noProof/>
+                    <w:webHidden/>
+                  </w:rPr>
+                </w:r>
+                <w:r>
+                  <w:rPr>
+                    <w:noProof/>
+                    <w:webHidden/>
+                  </w:rPr>
+                  <w:fldChar w:fldCharType="separate"/>
+                </w:r>
+                <w:r>
+                  <w:rPr>
+                    <w:noProof/>
+                    <w:webHidden/>
+                  </w:rPr>
+                  <w:t>22</w:t>
+                </w:r>
+                <w:r>
+                  <w:rPr>
+                    <w:noProof/>
+                    <w:webHidden/>
+                  </w:rPr>
+                  <w:fldChar w:fldCharType="end"/>
+                </w:r>
+              </w:hyperlink>
+            </w:p>
+            <w:p>
+              <w:pPr>
+                <w:pStyle w:val="TM3"/>
+                <w:tabs>
+                  <w:tab w:val="left" w:pos="1320"/>
+                  <w:tab w:val="right" w:leader="dot" w:pos="9062"/>
+                </w:tabs>
+                <w:jc w:val="both"/>
+                <w:rPr>
+                  <w:rFonts w:cstheme="minorBidi"/>
+                  <w:noProof/>
+                  <w:kern w:val="2"/>
+                  <w14:ligatures w14:val="standardContextual"/>
+                </w:rPr>
+              </w:pPr>
+              <w:hyperlink w:anchor="_Toc187043383" w:history="1">
+                <w:r>
+                  <w:rPr>
+                    <w:rStyle w:val="Lienhypertexte"/>
+                    <w:noProof/>
+                  </w:rPr>
+                  <w:t>2.5.7</w:t>
+                </w:r>
+                <w:r>
+                  <w:rPr>
+                    <w:rFonts w:cstheme="minorBidi"/>
+                    <w:noProof/>
+                    <w:kern w:val="2"/>
+                    <w14:ligatures w14:val="standardContextual"/>
+                  </w:rPr>
+                  <w:tab/>
+                </w:r>
+                <w:r>
+                  <w:rPr>
+                    <w:rStyle w:val="Lienhypertexte"/>
+                    <w:noProof/>
+                  </w:rPr>
+                  <w:t>Déconnexion</w:t>
+                </w:r>
+                <w:r>
+                  <w:rPr>
+                    <w:noProof/>
+                    <w:webHidden/>
+                  </w:rPr>
+                  <w:tab/>
+                </w:r>
+                <w:r>
+                  <w:rPr>
+                    <w:noProof/>
+                    <w:webHidden/>
+                  </w:rPr>
+                  <w:fldChar w:fldCharType="begin"/>
+                </w:r>
+                <w:r>
+                  <w:rPr>
+                    <w:noProof/>
+                    <w:webHidden/>
+                  </w:rPr>
+                  <w:instrText xml:space="preserve"> PAGEREF _Toc187043383 \h </w:instrText>
+                </w:r>
+                <w:r>
+                  <w:rPr>
+                    <w:noProof/>
+                    <w:webHidden/>
+                  </w:rPr>
+                </w:r>
+                <w:r>
+                  <w:rPr>
+                    <w:noProof/>
+                    <w:webHidden/>
+                  </w:rPr>
+                  <w:fldChar w:fldCharType="separate"/>
+                </w:r>
+                <w:r>
+                  <w:rPr>
+                    <w:noProof/>
+                    <w:webHidden/>
+                  </w:rPr>
+                  <w:t>24</w:t>
+                </w:r>
+                <w:r>
+                  <w:rPr>
+                    <w:noProof/>
+                    <w:webHidden/>
+                  </w:rPr>
+                  <w:fldChar w:fldCharType="end"/>
+                </w:r>
+              </w:hyperlink>
+            </w:p>
+            <w:p>
+              <w:pPr>
+                <w:pStyle w:val="TM3"/>
+                <w:tabs>
+                  <w:tab w:val="left" w:pos="1320"/>
+                  <w:tab w:val="right" w:leader="dot" w:pos="9062"/>
+                </w:tabs>
+                <w:jc w:val="both"/>
+                <w:rPr>
+                  <w:rFonts w:cstheme="minorBidi"/>
+                  <w:noProof/>
+                  <w:kern w:val="2"/>
+                  <w14:ligatures w14:val="standardContextual"/>
+                </w:rPr>
+              </w:pPr>
+              <w:hyperlink w:anchor="_Toc187043384" w:history="1">
+                <w:r>
+                  <w:rPr>
+                    <w:rStyle w:val="Lienhypertexte"/>
+                    <w:noProof/>
+                  </w:rPr>
+                  <w:t>2.5.8</w:t>
+                </w:r>
+                <w:r>
+                  <w:rPr>
+                    <w:rFonts w:cstheme="minorBidi"/>
+                    <w:noProof/>
+                    <w:kern w:val="2"/>
+                    <w14:ligatures w14:val="standardContextual"/>
+                  </w:rPr>
+                  <w:tab/>
+                </w:r>
+                <w:r>
+                  <w:rPr>
+                    <w:rStyle w:val="Lienhypertexte"/>
+                    <w:noProof/>
+                  </w:rPr>
+                  <w:t>Suppression de compte</w:t>
+                </w:r>
+                <w:r>
+                  <w:rPr>
+                    <w:noProof/>
+                    <w:webHidden/>
+                  </w:rPr>
+                  <w:tab/>
+                </w:r>
+                <w:r>
+                  <w:rPr>
+                    <w:noProof/>
+                    <w:webHidden/>
+                  </w:rPr>
+                  <w:fldChar w:fldCharType="begin"/>
+                </w:r>
+                <w:r>
+                  <w:rPr>
+                    <w:noProof/>
+                    <w:webHidden/>
+                  </w:rPr>
+                  <w:instrText xml:space="preserve"> PAGEREF _Toc187043384 \h </w:instrText>
+                </w:r>
+                <w:r>
+                  <w:rPr>
+                    <w:noProof/>
+                    <w:webHidden/>
+                  </w:rPr>
+                </w:r>
+                <w:r>
+                  <w:rPr>
+                    <w:noProof/>
+                    <w:webHidden/>
+                  </w:rPr>
+                  <w:fldChar w:fldCharType="separate"/>
+                </w:r>
+                <w:r>
+                  <w:rPr>
+                    <w:noProof/>
+                    <w:webHidden/>
+                  </w:rPr>
+                  <w:t>25</w:t>
                 </w:r>
                 <w:r>
                   <w:rPr>
@@ -1000,61 +2156,6 @@
     </w:p>
     <w:p>
       <w:pPr>
-        <w:jc w:val="both"/>
-      </w:pPr>
-    </w:p>
-    <w:p>
-      <w:pPr>
-        <w:jc w:val="both"/>
-      </w:pPr>
-    </w:p>
-    <w:p>
-      <w:pPr>
-        <w:jc w:val="both"/>
-      </w:pPr>
-    </w:p>
-    <w:p>
-      <w:pPr>
-        <w:jc w:val="both"/>
-      </w:pPr>
-    </w:p>
-    <w:p>
-      <w:pPr>
-        <w:jc w:val="both"/>
-      </w:pPr>
-    </w:p>
-    <w:p>
-      <w:pPr>
-        <w:jc w:val="both"/>
-      </w:pPr>
-    </w:p>
-    <w:p>
-      <w:pPr>
-        <w:jc w:val="both"/>
-      </w:pPr>
-    </w:p>
-    <w:p>
-      <w:pPr>
-        <w:jc w:val="both"/>
-      </w:pPr>
-    </w:p>
-    <w:p>
-      <w:pPr>
-        <w:jc w:val="both"/>
-      </w:pPr>
-    </w:p>
-    <w:p>
-      <w:pPr>
-        <w:jc w:val="both"/>
-      </w:pPr>
-    </w:p>
-    <w:p>
-      <w:pPr>
-        <w:jc w:val="both"/>
-      </w:pPr>
-    </w:p>
-    <w:p>
-      <w:pPr>
         <w:tabs>
           <w:tab w:val="left" w:pos="2400"/>
         </w:tabs>
@@ -1073,7 +2174,7 @@
         </w:numPr>
         <w:jc w:val="both"/>
       </w:pPr>
-      <w:bookmarkStart w:id="0" w:name="_Toc185575451"/>
+      <w:bookmarkStart w:id="0" w:name="_Toc187043363"/>
       <w:r>
         <w:lastRenderedPageBreak/>
         <w:t>Analyse préliminaire</w:t>
@@ -1089,7 +2190,7 @@
         </w:numPr>
         <w:jc w:val="both"/>
       </w:pPr>
-      <w:bookmarkStart w:id="1" w:name="_Toc185575452"/>
+      <w:bookmarkStart w:id="1" w:name="_Toc187043364"/>
       <w:r>
         <w:t>Introduction</w:t>
       </w:r>
@@ -1170,7 +2271,7 @@
         </w:numPr>
         <w:jc w:val="both"/>
       </w:pPr>
-      <w:bookmarkStart w:id="2" w:name="_Toc185575453"/>
+      <w:bookmarkStart w:id="2" w:name="_Toc187043365"/>
       <w:r>
         <w:t>Objectifs</w:t>
       </w:r>
@@ -1568,7 +2669,7 @@
         </w:numPr>
         <w:jc w:val="both"/>
       </w:pPr>
-      <w:bookmarkStart w:id="3" w:name="_Toc185575454"/>
+      <w:bookmarkStart w:id="3" w:name="_Toc187043366"/>
       <w:r>
         <w:t>Gestion de projet</w:t>
       </w:r>
@@ -1626,7 +2727,7 @@
         </w:numPr>
         <w:jc w:val="both"/>
       </w:pPr>
-      <w:bookmarkStart w:id="4" w:name="_Toc185575455"/>
+      <w:bookmarkStart w:id="4" w:name="_Toc187043367"/>
       <w:r>
         <w:t>Planification initiale</w:t>
       </w:r>
@@ -1949,7 +3050,7 @@
         </w:numPr>
         <w:jc w:val="both"/>
       </w:pPr>
-      <w:bookmarkStart w:id="5" w:name="_Toc185575456"/>
+      <w:bookmarkStart w:id="5" w:name="_Toc187043368"/>
       <w:r>
         <w:t>Test</w:t>
       </w:r>
@@ -1964,7 +3065,7 @@
         </w:numPr>
         <w:jc w:val="both"/>
       </w:pPr>
-      <w:bookmarkStart w:id="6" w:name="_Toc185575457"/>
+      <w:bookmarkStart w:id="6" w:name="_Toc187043369"/>
       <w:r>
         <w:t>Politique de Test</w:t>
       </w:r>
@@ -2122,7 +3223,7 @@
         </w:numPr>
         <w:jc w:val="both"/>
       </w:pPr>
-      <w:bookmarkStart w:id="7" w:name="_Toc185575458"/>
+      <w:bookmarkStart w:id="7" w:name="_Toc187043370"/>
       <w:r>
         <w:t>Stratégie de test</w:t>
       </w:r>
@@ -2658,7 +3759,7 @@
         </w:numPr>
         <w:jc w:val="both"/>
       </w:pPr>
-      <w:bookmarkStart w:id="8" w:name="_Toc185575459"/>
+      <w:bookmarkStart w:id="8" w:name="_Toc187043371"/>
       <w:r>
         <w:lastRenderedPageBreak/>
         <w:t>Plan de test</w:t>
@@ -3126,10 +4227,12 @@
         </w:numPr>
         <w:jc w:val="both"/>
       </w:pPr>
+      <w:bookmarkStart w:id="9" w:name="_Toc187043372"/>
       <w:r>
         <w:lastRenderedPageBreak/>
         <w:t>Test Backend</w:t>
       </w:r>
+      <w:bookmarkEnd w:id="9"/>
     </w:p>
     <w:p>
       <w:pPr>
@@ -3144,6 +4247,7 @@
           <w:szCs w:val="26"/>
         </w:rPr>
       </w:pPr>
+      <w:bookmarkStart w:id="10" w:name="_Toc187043373"/>
       <w:r>
         <w:rPr>
           <w:sz w:val="26"/>
@@ -3151,6 +4255,7 @@
         </w:rPr>
         <w:t>Authentification</w:t>
       </w:r>
+      <w:bookmarkEnd w:id="10"/>
     </w:p>
     <w:p>
       <w:pPr>
@@ -4093,9 +5198,11 @@
         </w:numPr>
         <w:jc w:val="both"/>
       </w:pPr>
+      <w:bookmarkStart w:id="11" w:name="_Toc187043374"/>
       <w:r>
         <w:t>Test Login</w:t>
       </w:r>
+      <w:bookmarkEnd w:id="11"/>
     </w:p>
     <w:p>
       <w:pPr>
@@ -4962,10 +6069,12 @@
         </w:numPr>
         <w:jc w:val="both"/>
       </w:pPr>
+      <w:bookmarkStart w:id="12" w:name="_Toc187043375"/>
       <w:r>
         <w:lastRenderedPageBreak/>
         <w:t>Gestion de l’utilisateur</w:t>
       </w:r>
+      <w:bookmarkEnd w:id="12"/>
     </w:p>
     <w:p>
       <w:pPr>
@@ -5762,9 +6871,11 @@
         </w:numPr>
         <w:jc w:val="both"/>
       </w:pPr>
+      <w:bookmarkStart w:id="13" w:name="_Toc187043376"/>
       <w:r>
         <w:t>Test E2E</w:t>
       </w:r>
+      <w:bookmarkEnd w:id="13"/>
     </w:p>
     <w:p>
       <w:pPr>
@@ -5779,6 +6890,7 @@
           <w:szCs w:val="26"/>
         </w:rPr>
       </w:pPr>
+      <w:bookmarkStart w:id="14" w:name="_Toc187043377"/>
       <w:r>
         <w:rPr>
           <w:sz w:val="26"/>
@@ -5786,6 +6898,7 @@
         </w:rPr>
         <w:t>Détails globaux</w:t>
       </w:r>
+      <w:bookmarkEnd w:id="14"/>
     </w:p>
     <w:p>
       <w:pPr>
@@ -5813,6 +6926,9 @@
         <w:jc w:val="both"/>
       </w:pPr>
       <w:r>
+        <w:rPr>
+          <w:noProof/>
+        </w:rPr>
         <w:drawing>
           <wp:inline distT="0" distB="0" distL="0" distR="0" wp14:anchorId="534B79CB" wp14:editId="118C550A">
             <wp:extent cx="3686689" cy="276264"/>
@@ -5975,6 +7091,7 @@
           <w:szCs w:val="26"/>
         </w:rPr>
       </w:pPr>
+      <w:bookmarkStart w:id="15" w:name="_Toc187043378"/>
       <w:r>
         <w:rPr>
           <w:sz w:val="26"/>
@@ -5982,6 +7099,7 @@
         </w:rPr>
         <w:t>Création de compte</w:t>
       </w:r>
+      <w:bookmarkEnd w:id="15"/>
     </w:p>
     <w:p>
       <w:pPr>
@@ -6025,7 +7143,7 @@
         <w:ind w:left="1428"/>
         <w:jc w:val="both"/>
       </w:pPr>
-      <w:bookmarkStart w:id="9" w:name="_Hlk186983000"/>
+      <w:bookmarkStart w:id="16" w:name="_Hlk186983000"/>
       <w:r>
         <w:t xml:space="preserve">Format </w:t>
       </w:r>
@@ -6048,8 +7166,8 @@
         <w:ind w:left="1428"/>
         <w:jc w:val="both"/>
       </w:pPr>
-      <w:bookmarkStart w:id="10" w:name="_Hlk186983145"/>
-      <w:bookmarkEnd w:id="9"/>
+      <w:bookmarkStart w:id="17" w:name="_Hlk186983145"/>
+      <w:bookmarkEnd w:id="16"/>
       <w:r>
         <w:t>Mot de passe trop court</w:t>
       </w:r>
@@ -6064,8 +7182,8 @@
         <w:ind w:left="1428"/>
         <w:jc w:val="both"/>
       </w:pPr>
-      <w:bookmarkStart w:id="11" w:name="_Hlk186983409"/>
-      <w:bookmarkEnd w:id="10"/>
+      <w:bookmarkStart w:id="18" w:name="_Hlk186983409"/>
+      <w:bookmarkEnd w:id="17"/>
       <w:r>
         <w:t>Mots de passe non correspondants</w:t>
       </w:r>
@@ -6080,8 +7198,8 @@
         <w:ind w:left="1428"/>
         <w:jc w:val="both"/>
       </w:pPr>
-      <w:bookmarkStart w:id="12" w:name="_Hlk186983622"/>
-      <w:bookmarkEnd w:id="11"/>
+      <w:bookmarkStart w:id="19" w:name="_Hlk186983622"/>
+      <w:bookmarkEnd w:id="18"/>
       <w:r>
         <w:t>Compte déjà existant</w:t>
       </w:r>
@@ -6096,12 +7214,12 @@
         <w:ind w:left="1428"/>
         <w:jc w:val="both"/>
       </w:pPr>
-      <w:bookmarkStart w:id="13" w:name="_Hlk186983472"/>
-      <w:bookmarkEnd w:id="12"/>
+      <w:bookmarkStart w:id="20" w:name="_Hlk186983472"/>
+      <w:bookmarkEnd w:id="19"/>
       <w:r>
         <w:t>Création d’un compte valide</w:t>
       </w:r>
-      <w:bookmarkEnd w:id="13"/>
+      <w:bookmarkEnd w:id="20"/>
     </w:p>
     <w:p>
       <w:pPr>
@@ -6137,6 +7255,9 @@
         <w:jc w:val="both"/>
       </w:pPr>
       <w:r>
+        <w:rPr>
+          <w:noProof/>
+        </w:rPr>
         <w:drawing>
           <wp:anchor distT="0" distB="0" distL="114300" distR="114300" simplePos="0" relativeHeight="251662336" behindDoc="0" locked="0" layoutInCell="1" allowOverlap="1" wp14:anchorId="35E0E019" wp14:editId="6B3CF22D">
             <wp:simplePos x="0" y="0"/>
@@ -6278,20 +7399,17 @@
       </w:r>
       <w:proofErr w:type="gramEnd"/>
       <w:r>
-        <w:t xml:space="preserve"> </w:t>
-      </w:r>
-      <w:r>
-        <w:t>au format incorrect</w:t>
-      </w:r>
-      <w:r>
-        <w:t xml:space="preserve"> et affiche une erreur.</w:t>
-      </w:r>
-    </w:p>
-    <w:p>
-      <w:pPr>
-        <w:jc w:val="both"/>
-      </w:pPr>
-      <w:r>
+        <w:t xml:space="preserve"> au format incorrect et affiche une erreur.</w:t>
+      </w:r>
+    </w:p>
+    <w:p>
+      <w:pPr>
+        <w:jc w:val="both"/>
+      </w:pPr>
+      <w:r>
+        <w:rPr>
+          <w:noProof/>
+        </w:rPr>
         <w:drawing>
           <wp:anchor distT="0" distB="0" distL="114300" distR="114300" simplePos="0" relativeHeight="251663360" behindDoc="0" locked="0" layoutInCell="1" allowOverlap="1" wp14:anchorId="59CCB8C5" wp14:editId="11861EB1">
             <wp:simplePos x="0" y="0"/>
@@ -6420,6 +7538,9 @@
         <w:jc w:val="both"/>
       </w:pPr>
       <w:r>
+        <w:rPr>
+          <w:noProof/>
+        </w:rPr>
         <w:drawing>
           <wp:anchor distT="0" distB="0" distL="114300" distR="114300" simplePos="0" relativeHeight="251664384" behindDoc="0" locked="0" layoutInCell="1" allowOverlap="1" wp14:anchorId="3AC2A11A" wp14:editId="2102D381">
             <wp:simplePos x="0" y="0"/>
@@ -6532,6 +7653,7 @@
           <w:bCs/>
           <w:i/>
           <w:iCs/>
+          <w:noProof/>
           <w:sz w:val="26"/>
           <w:szCs w:val="26"/>
         </w:rPr>
@@ -6644,6 +7766,7 @@
       </w:pPr>
       <w:r>
         <w:rPr>
+          <w:noProof/>
           <w:color w:val="000000" w:themeColor="text1"/>
         </w:rPr>
         <w:drawing>
@@ -6724,13 +7847,7 @@
         <w:rPr>
           <w:color w:val="000000" w:themeColor="text1"/>
         </w:rPr>
-        <w:t>che</w:t>
-      </w:r>
-      <w:r>
-        <w:rPr>
-          <w:color w:val="000000" w:themeColor="text1"/>
-        </w:rPr>
-        <w:t xml:space="preserve"> la création d’un compte avec un </w:t>
+        <w:t xml:space="preserve">che la création d’un compte avec un </w:t>
       </w:r>
       <w:proofErr w:type="gramStart"/>
       <w:r>
@@ -6829,6 +7946,9 @@
         <w:jc w:val="both"/>
       </w:pPr>
       <w:r>
+        <w:rPr>
+          <w:noProof/>
+        </w:rPr>
         <w:drawing>
           <wp:anchor distT="0" distB="0" distL="114300" distR="114300" simplePos="0" relativeHeight="251667456" behindDoc="0" locked="0" layoutInCell="1" allowOverlap="1" wp14:anchorId="28A9B337" wp14:editId="2EB03014">
             <wp:simplePos x="0" y="0"/>
@@ -6902,6 +8022,7 @@
           <w:szCs w:val="26"/>
         </w:rPr>
       </w:pPr>
+      <w:bookmarkStart w:id="21" w:name="_Toc187043379"/>
       <w:r>
         <w:rPr>
           <w:sz w:val="26"/>
@@ -6916,6 +8037,7 @@
         </w:rPr>
         <w:t>onnexion</w:t>
       </w:r>
+      <w:bookmarkEnd w:id="21"/>
     </w:p>
     <w:p>
       <w:pPr>
@@ -6986,11 +8108,11 @@
         </w:numPr>
         <w:jc w:val="both"/>
       </w:pPr>
-      <w:bookmarkStart w:id="14" w:name="_Hlk186984248"/>
+      <w:bookmarkStart w:id="22" w:name="_Hlk186984248"/>
       <w:r>
         <w:t>Utilisateur inexistant</w:t>
       </w:r>
-      <w:bookmarkEnd w:id="14"/>
+      <w:bookmarkEnd w:id="22"/>
     </w:p>
     <w:p>
       <w:pPr>
@@ -7056,6 +8178,9 @@
         <w:jc w:val="both"/>
       </w:pPr>
       <w:r>
+        <w:rPr>
+          <w:noProof/>
+        </w:rPr>
         <w:drawing>
           <wp:anchor distT="0" distB="0" distL="114300" distR="114300" simplePos="0" relativeHeight="251668480" behindDoc="0" locked="0" layoutInCell="1" allowOverlap="1" wp14:anchorId="67890327" wp14:editId="7BEBA548">
             <wp:simplePos x="0" y="0"/>
@@ -7201,6 +8326,9 @@
         <w:jc w:val="both"/>
       </w:pPr>
       <w:r>
+        <w:rPr>
+          <w:noProof/>
+        </w:rPr>
         <w:drawing>
           <wp:anchor distT="0" distB="0" distL="114300" distR="114300" simplePos="0" relativeHeight="251669504" behindDoc="0" locked="0" layoutInCell="1" allowOverlap="1" wp14:anchorId="65160888" wp14:editId="52B1A813">
             <wp:simplePos x="0" y="0"/>
@@ -7322,6 +8450,9 @@
         <w:jc w:val="both"/>
       </w:pPr>
       <w:r>
+        <w:rPr>
+          <w:noProof/>
+        </w:rPr>
         <w:drawing>
           <wp:anchor distT="0" distB="0" distL="114300" distR="114300" simplePos="0" relativeHeight="251670528" behindDoc="0" locked="0" layoutInCell="1" allowOverlap="1" wp14:anchorId="05322CD4" wp14:editId="41DE2B36">
             <wp:simplePos x="0" y="0"/>
@@ -7467,6 +8598,9 @@
         <w:jc w:val="both"/>
       </w:pPr>
       <w:r>
+        <w:rPr>
+          <w:noProof/>
+        </w:rPr>
         <w:drawing>
           <wp:anchor distT="0" distB="0" distL="114300" distR="114300" simplePos="0" relativeHeight="251671552" behindDoc="0" locked="0" layoutInCell="1" allowOverlap="1" wp14:anchorId="5DC2C0B4" wp14:editId="4150E7AB">
             <wp:simplePos x="0" y="0"/>
@@ -7580,6 +8714,9 @@
         <w:jc w:val="both"/>
       </w:pPr>
       <w:r>
+        <w:rPr>
+          <w:noProof/>
+        </w:rPr>
         <w:drawing>
           <wp:anchor distT="0" distB="0" distL="114300" distR="114300" simplePos="0" relativeHeight="251672576" behindDoc="0" locked="0" layoutInCell="1" allowOverlap="1" wp14:anchorId="4216B0BC" wp14:editId="2B3590BE">
             <wp:simplePos x="0" y="0"/>
@@ -7688,6 +8825,7 @@
           <w:szCs w:val="26"/>
         </w:rPr>
       </w:pPr>
+      <w:bookmarkStart w:id="23" w:name="_Toc187043380"/>
       <w:r>
         <w:rPr>
           <w:sz w:val="26"/>
@@ -7695,6 +8833,7 @@
         </w:rPr>
         <w:t>Gestion du profil</w:t>
       </w:r>
+      <w:bookmarkEnd w:id="23"/>
     </w:p>
     <w:p>
       <w:pPr>
@@ -7744,12 +8883,12 @@
         </w:numPr>
         <w:jc w:val="both"/>
       </w:pPr>
-      <w:bookmarkStart w:id="15" w:name="_Hlk186984834"/>
+      <w:bookmarkStart w:id="24" w:name="_Hlk186984834"/>
       <w:r>
         <w:t>Champs vides</w:t>
       </w:r>
     </w:p>
-    <w:bookmarkEnd w:id="15"/>
+    <w:bookmarkEnd w:id="24"/>
     <w:p>
       <w:pPr>
         <w:pStyle w:val="Paragraphedeliste"/>
@@ -7824,6 +8963,9 @@
         <w:jc w:val="both"/>
       </w:pPr>
       <w:r>
+        <w:rPr>
+          <w:noProof/>
+        </w:rPr>
         <w:drawing>
           <wp:anchor distT="0" distB="0" distL="114300" distR="114300" simplePos="0" relativeHeight="251673600" behindDoc="0" locked="0" layoutInCell="1" allowOverlap="1" wp14:anchorId="59097CCA" wp14:editId="0A49CDE6">
             <wp:simplePos x="0" y="0"/>
@@ -7977,6 +9119,9 @@
         <w:t>affiche un message d’erreur lorsque les champs requis ne sont pas remplis.</w:t>
       </w:r>
       <w:r>
+        <w:rPr>
+          <w:noProof/>
+        </w:rPr>
         <w:drawing>
           <wp:anchor distT="0" distB="0" distL="114300" distR="114300" simplePos="0" relativeHeight="251674624" behindDoc="0" locked="0" layoutInCell="1" allowOverlap="1" wp14:anchorId="237B5728" wp14:editId="12CE9499">
             <wp:simplePos x="0" y="0"/>
@@ -8070,6 +9215,9 @@
         <w:jc w:val="both"/>
       </w:pPr>
       <w:r>
+        <w:rPr>
+          <w:noProof/>
+        </w:rPr>
         <w:drawing>
           <wp:anchor distT="0" distB="0" distL="114300" distR="114300" simplePos="0" relativeHeight="251675648" behindDoc="0" locked="0" layoutInCell="1" allowOverlap="1" wp14:anchorId="12F33E03" wp14:editId="351F7047">
             <wp:simplePos x="0" y="0"/>
@@ -8121,13 +9269,7 @@
         </w:drawing>
       </w:r>
       <w:r>
-        <w:t xml:space="preserve">Ce test vérifie que les champs du profil (nom, adresse, etc.) peuvent être modifiés et </w:t>
-      </w:r>
-      <w:r>
-        <w:t>enregistré</w:t>
-      </w:r>
-      <w:r>
-        <w:t xml:space="preserve"> correctement.</w:t>
+        <w:t>Ce test vérifie que les champs du profil (nom, adresse, etc.) peuvent être modifiés et enregistré correctement.</w:t>
       </w:r>
     </w:p>
     <w:p>
@@ -8159,20 +9301,14 @@
           <w:szCs w:val="26"/>
         </w:rPr>
       </w:pPr>
+      <w:bookmarkStart w:id="25" w:name="_Toc187043381"/>
       <w:r>
         <w:rPr>
           <w:sz w:val="26"/>
           <w:szCs w:val="26"/>
         </w:rPr>
         <w:lastRenderedPageBreak/>
-        <w:t>Gestion d</w:t>
-      </w:r>
-      <w:r>
-        <w:rPr>
-          <w:sz w:val="26"/>
-          <w:szCs w:val="26"/>
-        </w:rPr>
-        <w:t>es t</w:t>
+        <w:t>Gestion des t</w:t>
       </w:r>
       <w:r>
         <w:t>â</w:t>
@@ -8184,6 +9320,7 @@
         </w:rPr>
         <w:t>ches</w:t>
       </w:r>
+      <w:bookmarkEnd w:id="25"/>
     </w:p>
     <w:p>
       <w:pPr>
@@ -8200,13 +9337,7 @@
         <w:t>ajout, validation, et suppression</w:t>
       </w:r>
       <w:r>
-        <w:t xml:space="preserve"> des t</w:t>
-      </w:r>
-      <w:r>
-        <w:t>â</w:t>
-      </w:r>
-      <w:r>
-        <w:t>ches</w:t>
+        <w:t xml:space="preserve"> des tâches</w:t>
       </w:r>
       <w:r>
         <w:t>. Les erreurs comme l’ajout sans description, sont également testées pour s’assurer qu’elles sont bien gérées.</w:t>
@@ -8243,12 +9374,12 @@
         </w:numPr>
         <w:jc w:val="both"/>
       </w:pPr>
-      <w:bookmarkStart w:id="16" w:name="_Hlk186985346"/>
+      <w:bookmarkStart w:id="26" w:name="_Hlk186985346"/>
       <w:r>
         <w:t>Ajout de tâches valides</w:t>
       </w:r>
     </w:p>
-    <w:bookmarkEnd w:id="16"/>
+    <w:bookmarkEnd w:id="26"/>
     <w:p>
       <w:pPr>
         <w:pStyle w:val="Paragraphedeliste"/>
@@ -8313,6 +9444,9 @@
         <w:jc w:val="both"/>
       </w:pPr>
       <w:r>
+        <w:rPr>
+          <w:noProof/>
+        </w:rPr>
         <w:drawing>
           <wp:anchor distT="0" distB="0" distL="114300" distR="114300" simplePos="0" relativeHeight="251676672" behindDoc="0" locked="0" layoutInCell="1" allowOverlap="1" wp14:anchorId="2AEE7DD4" wp14:editId="4AC26E7C">
             <wp:simplePos x="0" y="0"/>
@@ -8410,6 +9544,9 @@
         <w:jc w:val="both"/>
       </w:pPr>
       <w:r>
+        <w:rPr>
+          <w:noProof/>
+        </w:rPr>
         <w:drawing>
           <wp:anchor distT="0" distB="0" distL="114300" distR="114300" simplePos="0" relativeHeight="251677696" behindDoc="0" locked="0" layoutInCell="1" allowOverlap="1" wp14:anchorId="45DE04D6" wp14:editId="1F22400A">
             <wp:simplePos x="0" y="0"/>
@@ -8609,6 +9746,9 @@
         <w:jc w:val="both"/>
       </w:pPr>
       <w:r>
+        <w:rPr>
+          <w:noProof/>
+        </w:rPr>
         <w:drawing>
           <wp:anchor distT="0" distB="0" distL="114300" distR="114300" simplePos="0" relativeHeight="251678720" behindDoc="0" locked="0" layoutInCell="1" allowOverlap="1" wp14:anchorId="6DA727F4" wp14:editId="52CBC259">
             <wp:simplePos x="0" y="0"/>
@@ -8781,6 +9921,9 @@
         </w:rPr>
       </w:pPr>
       <w:r>
+        <w:rPr>
+          <w:noProof/>
+        </w:rPr>
         <w:drawing>
           <wp:anchor distT="0" distB="0" distL="114300" distR="114300" simplePos="0" relativeHeight="251679744" behindDoc="0" locked="0" layoutInCell="1" allowOverlap="1" wp14:anchorId="4BAFEFF0" wp14:editId="399198FF">
             <wp:simplePos x="0" y="0"/>
@@ -8869,6 +10012,7 @@
           <w:szCs w:val="26"/>
         </w:rPr>
       </w:pPr>
+      <w:bookmarkStart w:id="27" w:name="_Toc187043382"/>
       <w:r>
         <w:rPr>
           <w:sz w:val="26"/>
@@ -8876,6 +10020,7 @@
         </w:rPr>
         <w:t>Navigation</w:t>
       </w:r>
+      <w:bookmarkEnd w:id="27"/>
     </w:p>
     <w:p>
       <w:pPr>
@@ -8942,12 +10087,12 @@
         </w:numPr>
         <w:jc w:val="both"/>
       </w:pPr>
-      <w:bookmarkStart w:id="17" w:name="_Hlk186985856"/>
+      <w:bookmarkStart w:id="28" w:name="_Hlk186985856"/>
       <w:r>
         <w:t>Navigation vers la page "À propos"</w:t>
       </w:r>
     </w:p>
-    <w:bookmarkEnd w:id="17"/>
+    <w:bookmarkEnd w:id="28"/>
     <w:p>
       <w:pPr>
         <w:pStyle w:val="Paragraphedeliste"/>
@@ -9059,6 +10204,7 @@
       </w:pPr>
       <w:r>
         <w:rPr>
+          <w:noProof/>
           <w:color w:val="000000" w:themeColor="text1"/>
         </w:rPr>
         <w:drawing>
@@ -9212,7 +10358,7 @@
         <w:ind w:left="708"/>
         <w:jc w:val="both"/>
       </w:pPr>
-      <w:bookmarkStart w:id="18" w:name="_Hlk186986379"/>
+      <w:bookmarkStart w:id="29" w:name="_Hlk186986379"/>
       <w:r>
         <w:t>Ce test vérifie que l’utilisateur peut accéder à la page "À propos"</w:t>
       </w:r>
@@ -9220,13 +10366,16 @@
         <w:t>.</w:t>
       </w:r>
     </w:p>
-    <w:bookmarkEnd w:id="18"/>
+    <w:bookmarkEnd w:id="29"/>
     <w:p>
       <w:pPr>
         <w:ind w:left="708"/>
         <w:jc w:val="both"/>
       </w:pPr>
       <w:r>
+        <w:rPr>
+          <w:noProof/>
+        </w:rPr>
         <w:drawing>
           <wp:anchor distT="0" distB="0" distL="114300" distR="114300" simplePos="0" relativeHeight="251681792" behindDoc="1" locked="0" layoutInCell="1" allowOverlap="1" wp14:anchorId="10726571" wp14:editId="782EF8A7">
             <wp:simplePos x="0" y="0"/>
@@ -9387,7 +10536,7 @@
         <w:ind w:left="360" w:firstLine="348"/>
         <w:jc w:val="both"/>
       </w:pPr>
-      <w:bookmarkStart w:id="19" w:name="_Hlk186986014"/>
+      <w:bookmarkStart w:id="30" w:name="_Hlk186986014"/>
       <w:r>
         <w:t>Ce test vérifie que l’utilisateur peut accéder à la page "À propos"</w:t>
       </w:r>
@@ -9395,13 +10544,16 @@
         <w:t>.</w:t>
       </w:r>
     </w:p>
-    <w:bookmarkEnd w:id="19"/>
+    <w:bookmarkEnd w:id="30"/>
     <w:p>
       <w:pPr>
         <w:ind w:left="708"/>
         <w:jc w:val="both"/>
       </w:pPr>
       <w:r>
+        <w:rPr>
+          <w:noProof/>
+        </w:rPr>
         <w:drawing>
           <wp:anchor distT="0" distB="0" distL="114300" distR="114300" simplePos="0" relativeHeight="251682816" behindDoc="0" locked="0" layoutInCell="1" allowOverlap="1" wp14:anchorId="2E9E78F0" wp14:editId="45639D2B">
             <wp:simplePos x="0" y="0"/>
@@ -9555,6 +10707,9 @@
         <w:jc w:val="both"/>
       </w:pPr>
       <w:r>
+        <w:rPr>
+          <w:noProof/>
+        </w:rPr>
         <w:drawing>
           <wp:anchor distT="0" distB="0" distL="114300" distR="114300" simplePos="0" relativeHeight="251683840" behindDoc="0" locked="0" layoutInCell="1" allowOverlap="1" wp14:anchorId="40A594AD" wp14:editId="47D7F65F">
             <wp:simplePos x="0" y="0"/>
@@ -9662,6 +10817,7 @@
           <w:szCs w:val="26"/>
         </w:rPr>
       </w:pPr>
+      <w:bookmarkStart w:id="31" w:name="_Toc187043383"/>
       <w:r>
         <w:rPr>
           <w:sz w:val="26"/>
@@ -9669,6 +10825,7 @@
         </w:rPr>
         <w:t>Déconnexion</w:t>
       </w:r>
+      <w:bookmarkEnd w:id="31"/>
     </w:p>
     <w:p>
       <w:pPr>
@@ -9806,6 +10963,9 @@
         <w:jc w:val="both"/>
       </w:pPr>
       <w:r>
+        <w:rPr>
+          <w:noProof/>
+        </w:rPr>
         <w:drawing>
           <wp:anchor distT="0" distB="0" distL="114300" distR="114300" simplePos="0" relativeHeight="251684864" behindDoc="0" locked="0" layoutInCell="1" allowOverlap="1" wp14:anchorId="0D3D8CA2" wp14:editId="45E1DB97">
             <wp:simplePos x="0" y="0"/>
@@ -9933,6 +11093,7 @@
           <w:szCs w:val="26"/>
         </w:rPr>
       </w:pPr>
+      <w:bookmarkStart w:id="32" w:name="_Toc187043384"/>
       <w:r>
         <w:rPr>
           <w:sz w:val="26"/>
@@ -9940,6 +11101,7 @@
         </w:rPr>
         <w:t>Suppression de compte</w:t>
       </w:r>
+      <w:bookmarkEnd w:id="32"/>
     </w:p>
     <w:p>
       <w:pPr>
@@ -10023,13 +11185,7 @@
         <w:t xml:space="preserve">Ce test vérifie que l’utilisateur peut </w:t>
       </w:r>
       <w:r>
-        <w:t>s</w:t>
-      </w:r>
-      <w:r>
-        <w:t xml:space="preserve">upprimer son compte </w:t>
-      </w:r>
-      <w:r>
-        <w:t>en cliquant sur le bouton « </w:t>
+        <w:t>supprimer son compte en cliquant sur le bouton « </w:t>
       </w:r>
       <w:r>
         <w:t xml:space="preserve">Supprimer votre </w:t>
@@ -10049,6 +11205,9 @@
         <w:jc w:val="both"/>
       </w:pPr>
       <w:r>
+        <w:rPr>
+          <w:noProof/>
+        </w:rPr>
         <w:drawing>
           <wp:anchor distT="0" distB="0" distL="114300" distR="114300" simplePos="0" relativeHeight="251685888" behindDoc="0" locked="0" layoutInCell="1" allowOverlap="1" wp14:anchorId="15B7CB98" wp14:editId="44CE085C">
             <wp:simplePos x="0" y="0"/>
@@ -10136,6 +11295,9 @@
         <w:jc w:val="both"/>
       </w:pPr>
       <w:r>
+        <w:rPr>
+          <w:noProof/>
+        </w:rPr>
         <w:lastRenderedPageBreak/>
         <w:drawing>
           <wp:anchor distT="0" distB="0" distL="114300" distR="114300" simplePos="0" relativeHeight="251686912" behindDoc="0" locked="0" layoutInCell="1" allowOverlap="1" wp14:anchorId="4BB7451C" wp14:editId="2CCB1B28">
@@ -10202,9 +11364,600 @@
         <w:jc w:val="both"/>
       </w:pPr>
     </w:p>
+    <w:p>
+      <w:pPr>
+        <w:pStyle w:val="Titre2"/>
+        <w:numPr>
+          <w:ilvl w:val="1"/>
+          <w:numId w:val="1"/>
+        </w:numPr>
+        <w:jc w:val="both"/>
+      </w:pPr>
+      <w:r>
+        <w:t xml:space="preserve">Résultat </w:t>
+      </w:r>
+      <w:r>
+        <w:t xml:space="preserve">Campagne de </w:t>
+      </w:r>
+      <w:r>
+        <w:t>Test E2E</w:t>
+      </w:r>
+    </w:p>
+    <w:p>
+      <w:pPr>
+        <w:ind w:left="360"/>
+        <w:jc w:val="both"/>
+      </w:pPr>
+      <w:r>
+        <w:t xml:space="preserve">Tous les tests ont été exécutés et la majorité des fonctionnalités principales fonctionnent correctement. </w:t>
+      </w:r>
+    </w:p>
+    <w:p>
+      <w:pPr>
+        <w:ind w:left="360"/>
+        <w:jc w:val="both"/>
+      </w:pPr>
+      <w:r>
+        <w:t xml:space="preserve">Voici une capture d’écran des tests réussis dans </w:t>
+      </w:r>
+      <w:proofErr w:type="spellStart"/>
+      <w:r>
+        <w:t>Cypress</w:t>
+      </w:r>
+      <w:proofErr w:type="spellEnd"/>
+      <w:r>
+        <w:t xml:space="preserve"> : </w:t>
+      </w:r>
+    </w:p>
+    <w:p>
+      <w:pPr>
+        <w:ind w:left="360"/>
+        <w:jc w:val="both"/>
+      </w:pPr>
+      <w:r>
+        <w:drawing>
+          <wp:inline distT="0" distB="0" distL="0" distR="0" wp14:anchorId="12AC2164" wp14:editId="1FD9F2DA">
+            <wp:extent cx="5760720" cy="6031230"/>
+            <wp:effectExtent l="0" t="0" r="0" b="7620"/>
+            <wp:docPr id="39" name="Image 39"/>
+            <wp:cNvGraphicFramePr>
+              <a:graphicFrameLocks xmlns:a="http://schemas.openxmlformats.org/drawingml/2006/main" noChangeAspect="1"/>
+            </wp:cNvGraphicFramePr>
+            <a:graphic xmlns:a="http://schemas.openxmlformats.org/drawingml/2006/main">
+              <a:graphicData uri="http://schemas.openxmlformats.org/drawingml/2006/picture">
+                <pic:pic xmlns:pic="http://schemas.openxmlformats.org/drawingml/2006/picture">
+                  <pic:nvPicPr>
+                    <pic:cNvPr id="1" name=""/>
+                    <pic:cNvPicPr/>
+                  </pic:nvPicPr>
+                  <pic:blipFill>
+                    <a:blip r:embed="rId54"/>
+                    <a:stretch>
+                      <a:fillRect/>
+                    </a:stretch>
+                  </pic:blipFill>
+                  <pic:spPr>
+                    <a:xfrm>
+                      <a:off x="0" y="0"/>
+                      <a:ext cx="5760720" cy="6031230"/>
+                    </a:xfrm>
+                    <a:prstGeom prst="rect">
+                      <a:avLst/>
+                    </a:prstGeom>
+                  </pic:spPr>
+                </pic:pic>
+              </a:graphicData>
+            </a:graphic>
+          </wp:inline>
+        </w:drawing>
+      </w:r>
+    </w:p>
+    <w:p>
+      <w:pPr>
+        <w:jc w:val="both"/>
+      </w:pPr>
+      <w:r>
+        <w:lastRenderedPageBreak/>
+        <w:drawing>
+          <wp:anchor distT="0" distB="0" distL="114300" distR="114300" simplePos="0" relativeHeight="251687936" behindDoc="0" locked="0" layoutInCell="1" allowOverlap="1" wp14:anchorId="763DC572" wp14:editId="3C54354C">
+            <wp:simplePos x="0" y="0"/>
+            <wp:positionH relativeFrom="margin">
+              <wp:align>right</wp:align>
+            </wp:positionH>
+            <wp:positionV relativeFrom="paragraph">
+              <wp:posOffset>81280</wp:posOffset>
+            </wp:positionV>
+            <wp:extent cx="5760720" cy="922020"/>
+            <wp:effectExtent l="0" t="0" r="0" b="0"/>
+            <wp:wrapSquare wrapText="bothSides"/>
+            <wp:docPr id="52" name="Image 52"/>
+            <wp:cNvGraphicFramePr>
+              <a:graphicFrameLocks xmlns:a="http://schemas.openxmlformats.org/drawingml/2006/main" noChangeAspect="1"/>
+            </wp:cNvGraphicFramePr>
+            <a:graphic xmlns:a="http://schemas.openxmlformats.org/drawingml/2006/main">
+              <a:graphicData uri="http://schemas.openxmlformats.org/drawingml/2006/picture">
+                <pic:pic xmlns:pic="http://schemas.openxmlformats.org/drawingml/2006/picture">
+                  <pic:nvPicPr>
+                    <pic:cNvPr id="1" name=""/>
+                    <pic:cNvPicPr/>
+                  </pic:nvPicPr>
+                  <pic:blipFill>
+                    <a:blip r:embed="rId55">
+                      <a:extLst>
+                        <a:ext uri="{28A0092B-C50C-407E-A947-70E740481C1C}">
+                          <a14:useLocalDpi xmlns:a14="http://schemas.microsoft.com/office/drawing/2010/main" val="0"/>
+                        </a:ext>
+                      </a:extLst>
+                    </a:blip>
+                    <a:stretch>
+                      <a:fillRect/>
+                    </a:stretch>
+                  </pic:blipFill>
+                  <pic:spPr>
+                    <a:xfrm>
+                      <a:off x="0" y="0"/>
+                      <a:ext cx="5760720" cy="922020"/>
+                    </a:xfrm>
+                    <a:prstGeom prst="rect">
+                      <a:avLst/>
+                    </a:prstGeom>
+                  </pic:spPr>
+                </pic:pic>
+              </a:graphicData>
+            </a:graphic>
+          </wp:anchor>
+        </w:drawing>
+      </w:r>
+    </w:p>
+    <w:p>
+      <w:pPr>
+        <w:pStyle w:val="Titre2"/>
+        <w:numPr>
+          <w:ilvl w:val="1"/>
+          <w:numId w:val="1"/>
+        </w:numPr>
+        <w:jc w:val="both"/>
+      </w:pPr>
+      <w:r>
+        <w:t>R</w:t>
+      </w:r>
+      <w:r>
+        <w:t xml:space="preserve">apport de test </w:t>
+      </w:r>
+    </w:p>
+    <w:p>
+      <w:pPr>
+        <w:pStyle w:val="Titre3"/>
+        <w:numPr>
+          <w:ilvl w:val="2"/>
+          <w:numId w:val="1"/>
+        </w:numPr>
+        <w:jc w:val="both"/>
+        <w:rPr>
+          <w:sz w:val="26"/>
+          <w:szCs w:val="26"/>
+        </w:rPr>
+      </w:pPr>
+      <w:r>
+        <w:rPr>
+          <w:sz w:val="26"/>
+          <w:szCs w:val="26"/>
+        </w:rPr>
+        <w:t>Statuts</w:t>
+      </w:r>
+    </w:p>
+    <w:p>
+      <w:pPr>
+        <w:ind w:left="360"/>
+        <w:jc w:val="both"/>
+      </w:pPr>
+      <w:r>
+        <w:t>Les tests E2E ont été réalisés pour vérifier les principales fonctionnalités de l’application. Voici un résumé du statut des tests et des problèmes identifiés :</w:t>
+      </w:r>
+    </w:p>
+    <w:p>
+      <w:pPr>
+        <w:ind w:left="360"/>
+        <w:jc w:val="both"/>
+      </w:pPr>
+      <w:r>
+        <w:rPr>
+          <w:b/>
+          <w:bCs/>
+          <w:i/>
+          <w:iCs/>
+        </w:rPr>
+        <w:t>Résultats globaux Tests réussis :</w:t>
+      </w:r>
+      <w:r>
+        <w:t xml:space="preserve"> </w:t>
+      </w:r>
+    </w:p>
+    <w:p>
+      <w:pPr>
+        <w:ind w:left="360"/>
+        <w:jc w:val="both"/>
+      </w:pPr>
+      <w:r>
+        <w:t xml:space="preserve">La majorité des fonctionnalités principales, comme la création de compte, la connexion, la gestion du profil, la gestion des tâches et la navigation fonctionnent correctement et passent les tests sans problème. </w:t>
+      </w:r>
+    </w:p>
+    <w:p>
+      <w:pPr>
+        <w:ind w:left="360"/>
+        <w:jc w:val="both"/>
+      </w:pPr>
+      <w:r>
+        <w:rPr>
+          <w:b/>
+          <w:bCs/>
+          <w:i/>
+          <w:iCs/>
+        </w:rPr>
+        <w:t>Tests avec problèmes :</w:t>
+      </w:r>
+      <w:r>
+        <w:t xml:space="preserve"> </w:t>
+      </w:r>
+    </w:p>
+    <w:p>
+      <w:pPr>
+        <w:pStyle w:val="Paragraphedeliste"/>
+        <w:numPr>
+          <w:ilvl w:val="0"/>
+          <w:numId w:val="17"/>
+        </w:numPr>
+        <w:jc w:val="both"/>
+      </w:pPr>
+      <w:r>
+        <w:rPr>
+          <w:b/>
+          <w:bCs/>
+        </w:rPr>
+        <w:t xml:space="preserve">Déconnexion </w:t>
+      </w:r>
+      <w:r>
+        <w:t>: Après la déconnexion, l’application reste sur la page de gestion des tâches au lieu de rediriger vers la page de connexion ou d’accueil. Ce</w:t>
+      </w:r>
+      <w:r>
+        <w:t>la</w:t>
+      </w:r>
+      <w:r>
+        <w:t xml:space="preserve"> est incorrect, mais il n’empêche pas la déconnexion en elle-même. </w:t>
+      </w:r>
+      <w:r>
+        <w:t xml:space="preserve">Surtout que cela est seulement provoque avec </w:t>
+      </w:r>
+      <w:proofErr w:type="spellStart"/>
+      <w:r>
+        <w:t>cypress</w:t>
+      </w:r>
+      <w:proofErr w:type="spellEnd"/>
+      <w:r>
+        <w:t>.</w:t>
+      </w:r>
+    </w:p>
+    <w:p>
+      <w:pPr>
+        <w:pStyle w:val="Paragraphedeliste"/>
+        <w:jc w:val="both"/>
+      </w:pPr>
+    </w:p>
+    <w:p>
+      <w:pPr>
+        <w:pStyle w:val="Paragraphedeliste"/>
+        <w:numPr>
+          <w:ilvl w:val="0"/>
+          <w:numId w:val="17"/>
+        </w:numPr>
+        <w:jc w:val="both"/>
+      </w:pPr>
+      <w:r>
+        <w:rPr>
+          <w:b/>
+          <w:bCs/>
+        </w:rPr>
+        <w:t>Suppression de compte</w:t>
+      </w:r>
+      <w:r>
+        <w:t xml:space="preserve"> : La suppression d’un compte provoque un crash de l’application backend. L’exception générée n’est pas gérée, ce qui bloque tout</w:t>
+      </w:r>
+      <w:r>
+        <w:t xml:space="preserve"> exécution </w:t>
+      </w:r>
+      <w:r>
+        <w:t xml:space="preserve">après cette étape. </w:t>
+      </w:r>
+    </w:p>
+    <w:p>
+      <w:pPr>
+        <w:pStyle w:val="Paragraphedeliste"/>
+        <w:jc w:val="both"/>
+      </w:pPr>
+    </w:p>
+    <w:p>
+      <w:pPr>
+        <w:ind w:firstLine="360"/>
+        <w:jc w:val="both"/>
+        <w:rPr>
+          <w:b/>
+          <w:bCs/>
+          <w:i/>
+          <w:iCs/>
+        </w:rPr>
+      </w:pPr>
+      <w:r>
+        <w:rPr>
+          <w:b/>
+          <w:bCs/>
+          <w:i/>
+          <w:iCs/>
+        </w:rPr>
+        <w:t>Solutions envisagées</w:t>
+      </w:r>
+    </w:p>
+    <w:p>
+      <w:pPr>
+        <w:pStyle w:val="Paragraphedeliste"/>
+        <w:numPr>
+          <w:ilvl w:val="0"/>
+          <w:numId w:val="40"/>
+        </w:numPr>
+        <w:jc w:val="both"/>
+      </w:pPr>
+      <w:r>
+        <w:rPr>
+          <w:b/>
+          <w:bCs/>
+        </w:rPr>
+        <w:t>D</w:t>
+      </w:r>
+      <w:r>
+        <w:rPr>
+          <w:b/>
+          <w:bCs/>
+        </w:rPr>
+        <w:t>éconnexion</w:t>
+      </w:r>
+      <w:r>
+        <w:t xml:space="preserve"> : Une correction dans le code backend ou frontend est nécessaire pour ajouter une redirection après la </w:t>
+      </w:r>
+      <w:r>
+        <w:t>déconnexion</w:t>
+      </w:r>
+      <w:r>
+        <w:t xml:space="preserve">. Cela permettrait de ramener l’utilisateur à la page de connexion ou d’accueil. </w:t>
+      </w:r>
+    </w:p>
+    <w:p>
+      <w:pPr>
+        <w:pStyle w:val="Paragraphedeliste"/>
+        <w:ind w:left="765"/>
+        <w:jc w:val="both"/>
+      </w:pPr>
+    </w:p>
+    <w:p>
+      <w:pPr>
+        <w:pStyle w:val="Paragraphedeliste"/>
+        <w:numPr>
+          <w:ilvl w:val="0"/>
+          <w:numId w:val="40"/>
+        </w:numPr>
+        <w:jc w:val="both"/>
+      </w:pPr>
+      <w:r>
+        <w:rPr>
+          <w:b/>
+          <w:bCs/>
+        </w:rPr>
+        <w:t>S</w:t>
+      </w:r>
+      <w:r>
+        <w:rPr>
+          <w:b/>
+          <w:bCs/>
+        </w:rPr>
+        <w:t>uppression de compte</w:t>
+      </w:r>
+      <w:r>
+        <w:t xml:space="preserve"> : Le backend doit être modifié pour gérer l’exception liée à la suppression de compte. </w:t>
+      </w:r>
+      <w:r>
+        <w:t xml:space="preserve">Il faudrait donc </w:t>
+      </w:r>
+      <w:r>
+        <w:t>modifier</w:t>
+      </w:r>
+      <w:r>
+        <w:t xml:space="preserve"> le code afin de corriger cela.</w:t>
+      </w:r>
+    </w:p>
+    <w:p>
+      <w:pPr>
+        <w:pStyle w:val="Titre3"/>
+        <w:numPr>
+          <w:ilvl w:val="2"/>
+          <w:numId w:val="1"/>
+        </w:numPr>
+        <w:jc w:val="both"/>
+        <w:rPr>
+          <w:sz w:val="26"/>
+          <w:szCs w:val="26"/>
+        </w:rPr>
+      </w:pPr>
+      <w:r>
+        <w:rPr>
+          <w:sz w:val="26"/>
+          <w:szCs w:val="26"/>
+        </w:rPr>
+        <w:t>Conclusion</w:t>
+      </w:r>
+    </w:p>
+    <w:p>
+      <w:pPr>
+        <w:ind w:left="360"/>
+        <w:jc w:val="both"/>
+      </w:pPr>
+      <w:r>
+        <w:t xml:space="preserve">Les tests E2E montrent que les principales fonctionnalités de l’application fonctionnent correctement </w:t>
+      </w:r>
+      <w:r>
+        <w:t>et que les tests correspondent avec les plans établis</w:t>
+      </w:r>
+      <w:r>
+        <w:t xml:space="preserve">, ce qui garantit une bonne expérience utilisateur dans la plupart des cas. </w:t>
+      </w:r>
+    </w:p>
+    <w:p>
+      <w:pPr>
+        <w:ind w:left="360"/>
+        <w:jc w:val="both"/>
+      </w:pPr>
+      <w:r>
+        <w:t xml:space="preserve">Il faut tout de même corriger les problèmes aborder plus en haut, car cela permettrait de garantir </w:t>
+      </w:r>
+      <w:r>
+        <w:t>une meilleure fiabilité</w:t>
+      </w:r>
+      <w:r>
+        <w:t xml:space="preserve"> concernant la bonne exécution des fonctionnalités et afin que l’application soit </w:t>
+      </w:r>
+      <w:r>
+        <w:t>testée</w:t>
+      </w:r>
+      <w:r>
+        <w:t xml:space="preserve"> dans les bonne condition sans problèmes.</w:t>
+      </w:r>
+    </w:p>
+    <w:p>
+      <w:pPr>
+        <w:jc w:val="both"/>
+      </w:pPr>
+    </w:p>
+    <w:p>
+      <w:pPr>
+        <w:jc w:val="both"/>
+      </w:pPr>
+    </w:p>
+    <w:p>
+      <w:pPr>
+        <w:jc w:val="both"/>
+      </w:pPr>
+    </w:p>
+    <w:p>
+      <w:pPr>
+        <w:pStyle w:val="Titre2"/>
+        <w:numPr>
+          <w:ilvl w:val="1"/>
+          <w:numId w:val="1"/>
+        </w:numPr>
+        <w:jc w:val="both"/>
+      </w:pPr>
+      <w:r>
+        <w:lastRenderedPageBreak/>
+        <w:t>Conclusion</w:t>
+      </w:r>
+    </w:p>
+    <w:p>
+      <w:pPr>
+        <w:pStyle w:val="Titre3"/>
+        <w:numPr>
+          <w:ilvl w:val="2"/>
+          <w:numId w:val="1"/>
+        </w:numPr>
+        <w:jc w:val="both"/>
+        <w:rPr>
+          <w:sz w:val="26"/>
+          <w:szCs w:val="26"/>
+        </w:rPr>
+      </w:pPr>
+      <w:r>
+        <w:rPr>
+          <w:sz w:val="26"/>
+          <w:szCs w:val="26"/>
+        </w:rPr>
+        <w:t>Résultats finaux et conclusion</w:t>
+      </w:r>
+    </w:p>
+    <w:p>
+      <w:pPr>
+        <w:pStyle w:val="Titre3"/>
+        <w:numPr>
+          <w:ilvl w:val="2"/>
+          <w:numId w:val="1"/>
+        </w:numPr>
+        <w:jc w:val="both"/>
+        <w:rPr>
+          <w:sz w:val="26"/>
+          <w:szCs w:val="26"/>
+        </w:rPr>
+      </w:pPr>
+      <w:r>
+        <w:rPr>
+          <w:sz w:val="26"/>
+          <w:szCs w:val="26"/>
+        </w:rPr>
+        <w:t>Utilisation de l’IA</w:t>
+      </w:r>
+    </w:p>
+    <w:p>
+      <w:pPr>
+        <w:ind w:left="360"/>
+      </w:pPr>
+      <w:r>
+        <w:t xml:space="preserve">Ce projet était la première fois que nous effectuions des tests avec </w:t>
+      </w:r>
+      <w:proofErr w:type="spellStart"/>
+      <w:r>
+        <w:t>Cypress</w:t>
+      </w:r>
+      <w:proofErr w:type="spellEnd"/>
+      <w:r>
+        <w:t xml:space="preserve"> ou des tests unitaires en JavaScript. Nous avons utilisé l’IA pour nous aider à </w:t>
+      </w:r>
+      <w:r>
+        <w:t>faire</w:t>
+      </w:r>
+      <w:r>
+        <w:t xml:space="preserve"> des tâches que nous n’avions jamais </w:t>
+      </w:r>
+      <w:r>
+        <w:t>faites</w:t>
+      </w:r>
+      <w:r>
+        <w:t xml:space="preserve"> </w:t>
+      </w:r>
+      <w:r>
+        <w:t>avant</w:t>
+      </w:r>
+      <w:r>
+        <w:t xml:space="preserve">, comme comprendre la syntaxe de </w:t>
+      </w:r>
+      <w:proofErr w:type="spellStart"/>
+      <w:r>
+        <w:t>Jest</w:t>
+      </w:r>
+      <w:proofErr w:type="spellEnd"/>
+      <w:r>
+        <w:t xml:space="preserve"> pour créer des tests unitaires, ainsi que la syntaxe des tests E2E avec </w:t>
+      </w:r>
+      <w:proofErr w:type="spellStart"/>
+      <w:r>
+        <w:t>Cypress</w:t>
+      </w:r>
+      <w:proofErr w:type="spellEnd"/>
+      <w:r>
+        <w:t>. L’IA a également été utile pour corriger les fautes d’orthographe et de syntaxe dans le rapport de projet.</w:t>
+      </w:r>
+    </w:p>
+    <w:p>
+      <w:pPr>
+        <w:jc w:val="both"/>
+      </w:pPr>
+    </w:p>
     <w:sectPr>
-      <w:headerReference w:type="default" r:id="rId54"/>
-      <w:headerReference w:type="first" r:id="rId55"/>
+      <w:headerReference w:type="default" r:id="rId56"/>
+      <w:headerReference w:type="first" r:id="rId57"/>
       <w:pgSz w:w="11906" w:h="16838"/>
       <w:pgMar w:top="1417" w:right="1417" w:bottom="1417" w:left="1417" w:header="709" w:footer="708" w:gutter="0"/>
       <w:pgNumType w:start="0"/>
@@ -11531,6 +13284,127 @@
     </w:lvl>
   </w:abstractNum>
   <w:abstractNum w:abstractNumId="11" w15:restartNumberingAfterBreak="0">
+    <w:nsid w:val="424E5DC6"/>
+    <w:multiLevelType w:val="multilevel"/>
+    <w:tmpl w:val="0BEE03FA"/>
+    <w:lvl w:ilvl="0">
+      <w:start w:val="1"/>
+      <w:numFmt w:val="decimal"/>
+      <w:lvlText w:val="%1."/>
+      <w:lvlJc w:val="left"/>
+      <w:pPr>
+        <w:ind w:left="720" w:hanging="360"/>
+      </w:pPr>
+      <w:rPr>
+        <w:rFonts w:asciiTheme="minorHAnsi" w:eastAsiaTheme="minorHAnsi" w:hAnsiTheme="minorHAnsi" w:cstheme="minorBidi"/>
+      </w:rPr>
+    </w:lvl>
+    <w:lvl w:ilvl="1">
+      <w:start w:val="1"/>
+      <w:numFmt w:val="decimal"/>
+      <w:isLgl/>
+      <w:lvlText w:val="%1.%2"/>
+      <w:lvlJc w:val="left"/>
+      <w:pPr>
+        <w:ind w:left="750" w:hanging="390"/>
+      </w:pPr>
+      <w:rPr>
+        <w:rFonts w:hint="default"/>
+      </w:rPr>
+    </w:lvl>
+    <w:lvl w:ilvl="2">
+      <w:start w:val="1"/>
+      <w:numFmt w:val="decimal"/>
+      <w:isLgl/>
+      <w:lvlText w:val="%1.%2.%3"/>
+      <w:lvlJc w:val="left"/>
+      <w:pPr>
+        <w:ind w:left="1080" w:hanging="720"/>
+      </w:pPr>
+      <w:rPr>
+        <w:rFonts w:hint="default"/>
+      </w:rPr>
+    </w:lvl>
+    <w:lvl w:ilvl="3">
+      <w:start w:val="1"/>
+      <w:numFmt w:val="decimal"/>
+      <w:isLgl/>
+      <w:lvlText w:val="%1.%2.%3.%4"/>
+      <w:lvlJc w:val="left"/>
+      <w:pPr>
+        <w:ind w:left="1080" w:hanging="720"/>
+      </w:pPr>
+      <w:rPr>
+        <w:rFonts w:hint="default"/>
+      </w:rPr>
+    </w:lvl>
+    <w:lvl w:ilvl="4">
+      <w:start w:val="1"/>
+      <w:numFmt w:val="decimal"/>
+      <w:isLgl/>
+      <w:lvlText w:val="%1.%2.%3.%4.%5"/>
+      <w:lvlJc w:val="left"/>
+      <w:pPr>
+        <w:ind w:left="1440" w:hanging="1080"/>
+      </w:pPr>
+      <w:rPr>
+        <w:rFonts w:hint="default"/>
+      </w:rPr>
+    </w:lvl>
+    <w:lvl w:ilvl="5">
+      <w:start w:val="1"/>
+      <w:numFmt w:val="decimal"/>
+      <w:isLgl/>
+      <w:lvlText w:val="%1.%2.%3.%4.%5.%6"/>
+      <w:lvlJc w:val="left"/>
+      <w:pPr>
+        <w:ind w:left="1440" w:hanging="1080"/>
+      </w:pPr>
+      <w:rPr>
+        <w:rFonts w:hint="default"/>
+      </w:rPr>
+    </w:lvl>
+    <w:lvl w:ilvl="6">
+      <w:start w:val="1"/>
+      <w:numFmt w:val="decimal"/>
+      <w:isLgl/>
+      <w:lvlText w:val="%1.%2.%3.%4.%5.%6.%7"/>
+      <w:lvlJc w:val="left"/>
+      <w:pPr>
+        <w:ind w:left="1800" w:hanging="1440"/>
+      </w:pPr>
+      <w:rPr>
+        <w:rFonts w:hint="default"/>
+      </w:rPr>
+    </w:lvl>
+    <w:lvl w:ilvl="7">
+      <w:start w:val="1"/>
+      <w:numFmt w:val="decimal"/>
+      <w:isLgl/>
+      <w:lvlText w:val="%1.%2.%3.%4.%5.%6.%7.%8"/>
+      <w:lvlJc w:val="left"/>
+      <w:pPr>
+        <w:ind w:left="1800" w:hanging="1440"/>
+      </w:pPr>
+      <w:rPr>
+        <w:rFonts w:hint="default"/>
+      </w:rPr>
+    </w:lvl>
+    <w:lvl w:ilvl="8">
+      <w:start w:val="1"/>
+      <w:numFmt w:val="decimal"/>
+      <w:isLgl/>
+      <w:lvlText w:val="%1.%2.%3.%4.%5.%6.%7.%8.%9"/>
+      <w:lvlJc w:val="left"/>
+      <w:pPr>
+        <w:ind w:left="1800" w:hanging="1440"/>
+      </w:pPr>
+      <w:rPr>
+        <w:rFonts w:hint="default"/>
+      </w:rPr>
+    </w:lvl>
+  </w:abstractNum>
+  <w:abstractNum w:abstractNumId="12" w15:restartNumberingAfterBreak="0">
     <w:nsid w:val="435A14FD"/>
     <w:multiLevelType w:val="hybridMultilevel"/>
     <w:tmpl w:val="12024242"/>
@@ -11619,7 +13493,7 @@
       </w:pPr>
     </w:lvl>
   </w:abstractNum>
-  <w:abstractNum w:abstractNumId="12" w15:restartNumberingAfterBreak="0">
+  <w:abstractNum w:abstractNumId="13" w15:restartNumberingAfterBreak="0">
     <w:nsid w:val="43FD7D02"/>
     <w:multiLevelType w:val="multilevel"/>
     <w:tmpl w:val="03D0C400"/>
@@ -11768,7 +13642,7 @@
       </w:rPr>
     </w:lvl>
   </w:abstractNum>
-  <w:abstractNum w:abstractNumId="13" w15:restartNumberingAfterBreak="0">
+  <w:abstractNum w:abstractNumId="14" w15:restartNumberingAfterBreak="0">
     <w:nsid w:val="46B24CA1"/>
     <w:multiLevelType w:val="hybridMultilevel"/>
     <w:tmpl w:val="DE90EB9E"/>
@@ -11881,7 +13755,7 @@
       </w:rPr>
     </w:lvl>
   </w:abstractNum>
-  <w:abstractNum w:abstractNumId="14" w15:restartNumberingAfterBreak="0">
+  <w:abstractNum w:abstractNumId="15" w15:restartNumberingAfterBreak="0">
     <w:nsid w:val="478A4B74"/>
     <w:multiLevelType w:val="hybridMultilevel"/>
     <w:tmpl w:val="B998A850"/>
@@ -11994,7 +13868,120 @@
       </w:rPr>
     </w:lvl>
   </w:abstractNum>
-  <w:abstractNum w:abstractNumId="15" w15:restartNumberingAfterBreak="0">
+  <w:abstractNum w:abstractNumId="16" w15:restartNumberingAfterBreak="0">
+    <w:nsid w:val="48F46E3E"/>
+    <w:multiLevelType w:val="hybridMultilevel"/>
+    <w:tmpl w:val="349CCD44"/>
+    <w:lvl w:ilvl="0" w:tplc="100C0001">
+      <w:start w:val="1"/>
+      <w:numFmt w:val="bullet"/>
+      <w:lvlText w:val=""/>
+      <w:lvlJc w:val="left"/>
+      <w:pPr>
+        <w:ind w:left="765" w:hanging="360"/>
+      </w:pPr>
+      <w:rPr>
+        <w:rFonts w:ascii="Symbol" w:hAnsi="Symbol" w:hint="default"/>
+      </w:rPr>
+    </w:lvl>
+    <w:lvl w:ilvl="1" w:tplc="100C0003" w:tentative="1">
+      <w:start w:val="1"/>
+      <w:numFmt w:val="bullet"/>
+      <w:lvlText w:val="o"/>
+      <w:lvlJc w:val="left"/>
+      <w:pPr>
+        <w:ind w:left="1485" w:hanging="360"/>
+      </w:pPr>
+      <w:rPr>
+        <w:rFonts w:ascii="Courier New" w:hAnsi="Courier New" w:cs="Courier New" w:hint="default"/>
+      </w:rPr>
+    </w:lvl>
+    <w:lvl w:ilvl="2" w:tplc="100C0005" w:tentative="1">
+      <w:start w:val="1"/>
+      <w:numFmt w:val="bullet"/>
+      <w:lvlText w:val=""/>
+      <w:lvlJc w:val="left"/>
+      <w:pPr>
+        <w:ind w:left="2205" w:hanging="360"/>
+      </w:pPr>
+      <w:rPr>
+        <w:rFonts w:ascii="Wingdings" w:hAnsi="Wingdings" w:hint="default"/>
+      </w:rPr>
+    </w:lvl>
+    <w:lvl w:ilvl="3" w:tplc="100C0001" w:tentative="1">
+      <w:start w:val="1"/>
+      <w:numFmt w:val="bullet"/>
+      <w:lvlText w:val=""/>
+      <w:lvlJc w:val="left"/>
+      <w:pPr>
+        <w:ind w:left="2925" w:hanging="360"/>
+      </w:pPr>
+      <w:rPr>
+        <w:rFonts w:ascii="Symbol" w:hAnsi="Symbol" w:hint="default"/>
+      </w:rPr>
+    </w:lvl>
+    <w:lvl w:ilvl="4" w:tplc="100C0003" w:tentative="1">
+      <w:start w:val="1"/>
+      <w:numFmt w:val="bullet"/>
+      <w:lvlText w:val="o"/>
+      <w:lvlJc w:val="left"/>
+      <w:pPr>
+        <w:ind w:left="3645" w:hanging="360"/>
+      </w:pPr>
+      <w:rPr>
+        <w:rFonts w:ascii="Courier New" w:hAnsi="Courier New" w:cs="Courier New" w:hint="default"/>
+      </w:rPr>
+    </w:lvl>
+    <w:lvl w:ilvl="5" w:tplc="100C0005" w:tentative="1">
+      <w:start w:val="1"/>
+      <w:numFmt w:val="bullet"/>
+      <w:lvlText w:val=""/>
+      <w:lvlJc w:val="left"/>
+      <w:pPr>
+        <w:ind w:left="4365" w:hanging="360"/>
+      </w:pPr>
+      <w:rPr>
+        <w:rFonts w:ascii="Wingdings" w:hAnsi="Wingdings" w:hint="default"/>
+      </w:rPr>
+    </w:lvl>
+    <w:lvl w:ilvl="6" w:tplc="100C0001" w:tentative="1">
+      <w:start w:val="1"/>
+      <w:numFmt w:val="bullet"/>
+      <w:lvlText w:val=""/>
+      <w:lvlJc w:val="left"/>
+      <w:pPr>
+        <w:ind w:left="5085" w:hanging="360"/>
+      </w:pPr>
+      <w:rPr>
+        <w:rFonts w:ascii="Symbol" w:hAnsi="Symbol" w:hint="default"/>
+      </w:rPr>
+    </w:lvl>
+    <w:lvl w:ilvl="7" w:tplc="100C0003" w:tentative="1">
+      <w:start w:val="1"/>
+      <w:numFmt w:val="bullet"/>
+      <w:lvlText w:val="o"/>
+      <w:lvlJc w:val="left"/>
+      <w:pPr>
+        <w:ind w:left="5805" w:hanging="360"/>
+      </w:pPr>
+      <w:rPr>
+        <w:rFonts w:ascii="Courier New" w:hAnsi="Courier New" w:cs="Courier New" w:hint="default"/>
+      </w:rPr>
+    </w:lvl>
+    <w:lvl w:ilvl="8" w:tplc="100C0005" w:tentative="1">
+      <w:start w:val="1"/>
+      <w:numFmt w:val="bullet"/>
+      <w:lvlText w:val=""/>
+      <w:lvlJc w:val="left"/>
+      <w:pPr>
+        <w:ind w:left="6525" w:hanging="360"/>
+      </w:pPr>
+      <w:rPr>
+        <w:rFonts w:ascii="Wingdings" w:hAnsi="Wingdings" w:hint="default"/>
+      </w:rPr>
+    </w:lvl>
+  </w:abstractNum>
+  <w:abstractNum w:abstractNumId="17" w15:restartNumberingAfterBreak="0">
     <w:nsid w:val="49951C97"/>
     <w:multiLevelType w:val="hybridMultilevel"/>
     <w:tmpl w:val="2B92F014"/>
@@ -12087,7 +14074,7 @@
       </w:pPr>
     </w:lvl>
   </w:abstractNum>
-  <w:abstractNum w:abstractNumId="16" w15:restartNumberingAfterBreak="0">
+  <w:abstractNum w:abstractNumId="18" w15:restartNumberingAfterBreak="0">
     <w:nsid w:val="4B2A3EFE"/>
     <w:multiLevelType w:val="hybridMultilevel"/>
     <w:tmpl w:val="903CE718"/>
@@ -12200,7 +14187,7 @@
       </w:rPr>
     </w:lvl>
   </w:abstractNum>
-  <w:abstractNum w:abstractNumId="17" w15:restartNumberingAfterBreak="0">
+  <w:abstractNum w:abstractNumId="19" w15:restartNumberingAfterBreak="0">
     <w:nsid w:val="4CBC1CBB"/>
     <w:multiLevelType w:val="hybridMultilevel"/>
     <w:tmpl w:val="2B92F014"/>
@@ -12293,7 +14280,7 @@
       </w:pPr>
     </w:lvl>
   </w:abstractNum>
-  <w:abstractNum w:abstractNumId="18" w15:restartNumberingAfterBreak="0">
+  <w:abstractNum w:abstractNumId="20" w15:restartNumberingAfterBreak="0">
     <w:nsid w:val="5222170D"/>
     <w:multiLevelType w:val="hybridMultilevel"/>
     <w:tmpl w:val="FE886AB4"/>
@@ -12406,7 +14393,128 @@
       </w:rPr>
     </w:lvl>
   </w:abstractNum>
-  <w:abstractNum w:abstractNumId="19" w15:restartNumberingAfterBreak="0">
+  <w:abstractNum w:abstractNumId="21" w15:restartNumberingAfterBreak="0">
+    <w:nsid w:val="525D72F2"/>
+    <w:multiLevelType w:val="multilevel"/>
+    <w:tmpl w:val="0BEE03FA"/>
+    <w:lvl w:ilvl="0">
+      <w:start w:val="1"/>
+      <w:numFmt w:val="decimal"/>
+      <w:lvlText w:val="%1."/>
+      <w:lvlJc w:val="left"/>
+      <w:pPr>
+        <w:ind w:left="720" w:hanging="360"/>
+      </w:pPr>
+      <w:rPr>
+        <w:rFonts w:asciiTheme="minorHAnsi" w:eastAsiaTheme="minorHAnsi" w:hAnsiTheme="minorHAnsi" w:cstheme="minorBidi"/>
+      </w:rPr>
+    </w:lvl>
+    <w:lvl w:ilvl="1">
+      <w:start w:val="1"/>
+      <w:numFmt w:val="decimal"/>
+      <w:isLgl/>
+      <w:lvlText w:val="%1.%2"/>
+      <w:lvlJc w:val="left"/>
+      <w:pPr>
+        <w:ind w:left="750" w:hanging="390"/>
+      </w:pPr>
+      <w:rPr>
+        <w:rFonts w:hint="default"/>
+      </w:rPr>
+    </w:lvl>
+    <w:lvl w:ilvl="2">
+      <w:start w:val="1"/>
+      <w:numFmt w:val="decimal"/>
+      <w:isLgl/>
+      <w:lvlText w:val="%1.%2.%3"/>
+      <w:lvlJc w:val="left"/>
+      <w:pPr>
+        <w:ind w:left="1080" w:hanging="720"/>
+      </w:pPr>
+      <w:rPr>
+        <w:rFonts w:hint="default"/>
+      </w:rPr>
+    </w:lvl>
+    <w:lvl w:ilvl="3">
+      <w:start w:val="1"/>
+      <w:numFmt w:val="decimal"/>
+      <w:isLgl/>
+      <w:lvlText w:val="%1.%2.%3.%4"/>
+      <w:lvlJc w:val="left"/>
+      <w:pPr>
+        <w:ind w:left="1080" w:hanging="720"/>
+      </w:pPr>
+      <w:rPr>
+        <w:rFonts w:hint="default"/>
+      </w:rPr>
+    </w:lvl>
+    <w:lvl w:ilvl="4">
+      <w:start w:val="1"/>
+      <w:numFmt w:val="decimal"/>
+      <w:isLgl/>
+      <w:lvlText w:val="%1.%2.%3.%4.%5"/>
+      <w:lvlJc w:val="left"/>
+      <w:pPr>
+        <w:ind w:left="1440" w:hanging="1080"/>
+      </w:pPr>
+      <w:rPr>
+        <w:rFonts w:hint="default"/>
+      </w:rPr>
+    </w:lvl>
+    <w:lvl w:ilvl="5">
+      <w:start w:val="1"/>
+      <w:numFmt w:val="decimal"/>
+      <w:isLgl/>
+      <w:lvlText w:val="%1.%2.%3.%4.%5.%6"/>
+      <w:lvlJc w:val="left"/>
+      <w:pPr>
+        <w:ind w:left="1440" w:hanging="1080"/>
+      </w:pPr>
+      <w:rPr>
+        <w:rFonts w:hint="default"/>
+      </w:rPr>
+    </w:lvl>
+    <w:lvl w:ilvl="6">
+      <w:start w:val="1"/>
+      <w:numFmt w:val="decimal"/>
+      <w:isLgl/>
+      <w:lvlText w:val="%1.%2.%3.%4.%5.%6.%7"/>
+      <w:lvlJc w:val="left"/>
+      <w:pPr>
+        <w:ind w:left="1800" w:hanging="1440"/>
+      </w:pPr>
+      <w:rPr>
+        <w:rFonts w:hint="default"/>
+      </w:rPr>
+    </w:lvl>
+    <w:lvl w:ilvl="7">
+      <w:start w:val="1"/>
+      <w:numFmt w:val="decimal"/>
+      <w:isLgl/>
+      <w:lvlText w:val="%1.%2.%3.%4.%5.%6.%7.%8"/>
+      <w:lvlJc w:val="left"/>
+      <w:pPr>
+        <w:ind w:left="1800" w:hanging="1440"/>
+      </w:pPr>
+      <w:rPr>
+        <w:rFonts w:hint="default"/>
+      </w:rPr>
+    </w:lvl>
+    <w:lvl w:ilvl="8">
+      <w:start w:val="1"/>
+      <w:numFmt w:val="decimal"/>
+      <w:isLgl/>
+      <w:lvlText w:val="%1.%2.%3.%4.%5.%6.%7.%8.%9"/>
+      <w:lvlJc w:val="left"/>
+      <w:pPr>
+        <w:ind w:left="1800" w:hanging="1440"/>
+      </w:pPr>
+      <w:rPr>
+        <w:rFonts w:hint="default"/>
+      </w:rPr>
+    </w:lvl>
+  </w:abstractNum>
+  <w:abstractNum w:abstractNumId="22" w15:restartNumberingAfterBreak="0">
     <w:nsid w:val="52FE2E9D"/>
     <w:multiLevelType w:val="hybridMultilevel"/>
     <w:tmpl w:val="59CE9F8A"/>
@@ -12495,7 +14603,7 @@
       </w:pPr>
     </w:lvl>
   </w:abstractNum>
-  <w:abstractNum w:abstractNumId="20" w15:restartNumberingAfterBreak="0">
+  <w:abstractNum w:abstractNumId="23" w15:restartNumberingAfterBreak="0">
     <w:nsid w:val="54F575DD"/>
     <w:multiLevelType w:val="hybridMultilevel"/>
     <w:tmpl w:val="72187D18"/>
@@ -12584,7 +14692,7 @@
       </w:pPr>
     </w:lvl>
   </w:abstractNum>
-  <w:abstractNum w:abstractNumId="21" w15:restartNumberingAfterBreak="0">
+  <w:abstractNum w:abstractNumId="24" w15:restartNumberingAfterBreak="0">
     <w:nsid w:val="578711DF"/>
     <w:multiLevelType w:val="hybridMultilevel"/>
     <w:tmpl w:val="2B92F014"/>
@@ -12677,7 +14785,7 @@
       </w:pPr>
     </w:lvl>
   </w:abstractNum>
-  <w:abstractNum w:abstractNumId="22" w15:restartNumberingAfterBreak="0">
+  <w:abstractNum w:abstractNumId="25" w15:restartNumberingAfterBreak="0">
     <w:nsid w:val="592C3193"/>
     <w:multiLevelType w:val="hybridMultilevel"/>
     <w:tmpl w:val="3B38282A"/>
@@ -12766,7 +14874,7 @@
       </w:pPr>
     </w:lvl>
   </w:abstractNum>
-  <w:abstractNum w:abstractNumId="23" w15:restartNumberingAfterBreak="0">
+  <w:abstractNum w:abstractNumId="26" w15:restartNumberingAfterBreak="0">
     <w:nsid w:val="5A4F4CA5"/>
     <w:multiLevelType w:val="hybridMultilevel"/>
     <w:tmpl w:val="1CA08AB8"/>
@@ -12855,7 +14963,7 @@
       </w:pPr>
     </w:lvl>
   </w:abstractNum>
-  <w:abstractNum w:abstractNumId="24" w15:restartNumberingAfterBreak="0">
+  <w:abstractNum w:abstractNumId="27" w15:restartNumberingAfterBreak="0">
     <w:nsid w:val="5A6C2FB3"/>
     <w:multiLevelType w:val="hybridMultilevel"/>
     <w:tmpl w:val="E7A0842C"/>
@@ -12944,7 +15052,7 @@
       </w:pPr>
     </w:lvl>
   </w:abstractNum>
-  <w:abstractNum w:abstractNumId="25" w15:restartNumberingAfterBreak="0">
+  <w:abstractNum w:abstractNumId="28" w15:restartNumberingAfterBreak="0">
     <w:nsid w:val="610A74DC"/>
     <w:multiLevelType w:val="hybridMultilevel"/>
     <w:tmpl w:val="2B92F014"/>
@@ -13037,7 +15145,7 @@
       </w:pPr>
     </w:lvl>
   </w:abstractNum>
-  <w:abstractNum w:abstractNumId="26" w15:restartNumberingAfterBreak="0">
+  <w:abstractNum w:abstractNumId="29" w15:restartNumberingAfterBreak="0">
     <w:nsid w:val="67B44202"/>
     <w:multiLevelType w:val="hybridMultilevel"/>
     <w:tmpl w:val="2B92F014"/>
@@ -13130,7 +15238,7 @@
       </w:pPr>
     </w:lvl>
   </w:abstractNum>
-  <w:abstractNum w:abstractNumId="27" w15:restartNumberingAfterBreak="0">
+  <w:abstractNum w:abstractNumId="30" w15:restartNumberingAfterBreak="0">
     <w:nsid w:val="69664C5E"/>
     <w:multiLevelType w:val="multilevel"/>
     <w:tmpl w:val="0BEE03FA"/>
@@ -13251,7 +15359,7 @@
       </w:rPr>
     </w:lvl>
   </w:abstractNum>
-  <w:abstractNum w:abstractNumId="28" w15:restartNumberingAfterBreak="0">
+  <w:abstractNum w:abstractNumId="31" w15:restartNumberingAfterBreak="0">
     <w:nsid w:val="6B3F167A"/>
     <w:multiLevelType w:val="multilevel"/>
     <w:tmpl w:val="C39A5F60"/>
@@ -13372,7 +15480,7 @@
       </w:rPr>
     </w:lvl>
   </w:abstractNum>
-  <w:abstractNum w:abstractNumId="29" w15:restartNumberingAfterBreak="0">
+  <w:abstractNum w:abstractNumId="32" w15:restartNumberingAfterBreak="0">
     <w:nsid w:val="70BF0E87"/>
     <w:multiLevelType w:val="multilevel"/>
     <w:tmpl w:val="0BEE03FA"/>
@@ -13493,7 +15601,7 @@
       </w:rPr>
     </w:lvl>
   </w:abstractNum>
-  <w:abstractNum w:abstractNumId="30" w15:restartNumberingAfterBreak="0">
+  <w:abstractNum w:abstractNumId="33" w15:restartNumberingAfterBreak="0">
     <w:nsid w:val="71EE12BC"/>
     <w:multiLevelType w:val="multilevel"/>
     <w:tmpl w:val="6510A72A"/>
@@ -13640,20 +15748,20 @@
       </w:rPr>
     </w:lvl>
   </w:abstractNum>
-  <w:abstractNum w:abstractNumId="31" w15:restartNumberingAfterBreak="0">
+  <w:abstractNum w:abstractNumId="34" w15:restartNumberingAfterBreak="0">
     <w:nsid w:val="76CD79AE"/>
     <w:multiLevelType w:val="hybridMultilevel"/>
-    <w:tmpl w:val="2E72289E"/>
-    <w:lvl w:ilvl="0" w:tplc="AE9E925A">
-      <w:start w:val="2"/>
+    <w:tmpl w:val="C58AD834"/>
+    <w:lvl w:ilvl="0" w:tplc="100C0001">
+      <w:start w:val="1"/>
       <w:numFmt w:val="bullet"/>
-      <w:lvlText w:val="-"/>
+      <w:lvlText w:val=""/>
       <w:lvlJc w:val="left"/>
       <w:pPr>
         <w:ind w:left="720" w:hanging="360"/>
       </w:pPr>
       <w:rPr>
-        <w:rFonts w:ascii="Calibri" w:eastAsiaTheme="minorHAnsi" w:hAnsi="Calibri" w:cs="Calibri" w:hint="default"/>
+        <w:rFonts w:ascii="Symbol" w:hAnsi="Symbol" w:hint="default"/>
       </w:rPr>
     </w:lvl>
     <w:lvl w:ilvl="1" w:tplc="100C0003" w:tentative="1">
@@ -13753,7 +15861,7 @@
       </w:rPr>
     </w:lvl>
   </w:abstractNum>
-  <w:abstractNum w:abstractNumId="32" w15:restartNumberingAfterBreak="0">
+  <w:abstractNum w:abstractNumId="35" w15:restartNumberingAfterBreak="0">
     <w:nsid w:val="77747E30"/>
     <w:multiLevelType w:val="hybridMultilevel"/>
     <w:tmpl w:val="2B92F014"/>
@@ -13846,7 +15954,7 @@
       </w:pPr>
     </w:lvl>
   </w:abstractNum>
-  <w:abstractNum w:abstractNumId="33" w15:restartNumberingAfterBreak="0">
+  <w:abstractNum w:abstractNumId="36" w15:restartNumberingAfterBreak="0">
     <w:nsid w:val="79132CA3"/>
     <w:multiLevelType w:val="hybridMultilevel"/>
     <w:tmpl w:val="2B92F014"/>
@@ -13939,7 +16047,7 @@
       </w:pPr>
     </w:lvl>
   </w:abstractNum>
-  <w:abstractNum w:abstractNumId="34" w15:restartNumberingAfterBreak="0">
+  <w:abstractNum w:abstractNumId="37" w15:restartNumberingAfterBreak="0">
     <w:nsid w:val="7CB45ADD"/>
     <w:multiLevelType w:val="hybridMultilevel"/>
     <w:tmpl w:val="F7DAF148"/>
@@ -14028,7 +16136,7 @@
       </w:pPr>
     </w:lvl>
   </w:abstractNum>
-  <w:abstractNum w:abstractNumId="35" w15:restartNumberingAfterBreak="0">
+  <w:abstractNum w:abstractNumId="38" w15:restartNumberingAfterBreak="0">
     <w:nsid w:val="7D161309"/>
     <w:multiLevelType w:val="hybridMultilevel"/>
     <w:tmpl w:val="2C46CF0C"/>
@@ -14117,47 +16225,168 @@
       </w:pPr>
     </w:lvl>
   </w:abstractNum>
+  <w:abstractNum w:abstractNumId="39" w15:restartNumberingAfterBreak="0">
+    <w:nsid w:val="7DD06170"/>
+    <w:multiLevelType w:val="multilevel"/>
+    <w:tmpl w:val="0BEE03FA"/>
+    <w:lvl w:ilvl="0">
+      <w:start w:val="1"/>
+      <w:numFmt w:val="decimal"/>
+      <w:lvlText w:val="%1."/>
+      <w:lvlJc w:val="left"/>
+      <w:pPr>
+        <w:ind w:left="720" w:hanging="360"/>
+      </w:pPr>
+      <w:rPr>
+        <w:rFonts w:asciiTheme="minorHAnsi" w:eastAsiaTheme="minorHAnsi" w:hAnsiTheme="minorHAnsi" w:cstheme="minorBidi"/>
+      </w:rPr>
+    </w:lvl>
+    <w:lvl w:ilvl="1">
+      <w:start w:val="1"/>
+      <w:numFmt w:val="decimal"/>
+      <w:isLgl/>
+      <w:lvlText w:val="%1.%2"/>
+      <w:lvlJc w:val="left"/>
+      <w:pPr>
+        <w:ind w:left="750" w:hanging="390"/>
+      </w:pPr>
+      <w:rPr>
+        <w:rFonts w:hint="default"/>
+      </w:rPr>
+    </w:lvl>
+    <w:lvl w:ilvl="2">
+      <w:start w:val="1"/>
+      <w:numFmt w:val="decimal"/>
+      <w:isLgl/>
+      <w:lvlText w:val="%1.%2.%3"/>
+      <w:lvlJc w:val="left"/>
+      <w:pPr>
+        <w:ind w:left="1080" w:hanging="720"/>
+      </w:pPr>
+      <w:rPr>
+        <w:rFonts w:hint="default"/>
+      </w:rPr>
+    </w:lvl>
+    <w:lvl w:ilvl="3">
+      <w:start w:val="1"/>
+      <w:numFmt w:val="decimal"/>
+      <w:isLgl/>
+      <w:lvlText w:val="%1.%2.%3.%4"/>
+      <w:lvlJc w:val="left"/>
+      <w:pPr>
+        <w:ind w:left="1080" w:hanging="720"/>
+      </w:pPr>
+      <w:rPr>
+        <w:rFonts w:hint="default"/>
+      </w:rPr>
+    </w:lvl>
+    <w:lvl w:ilvl="4">
+      <w:start w:val="1"/>
+      <w:numFmt w:val="decimal"/>
+      <w:isLgl/>
+      <w:lvlText w:val="%1.%2.%3.%4.%5"/>
+      <w:lvlJc w:val="left"/>
+      <w:pPr>
+        <w:ind w:left="1440" w:hanging="1080"/>
+      </w:pPr>
+      <w:rPr>
+        <w:rFonts w:hint="default"/>
+      </w:rPr>
+    </w:lvl>
+    <w:lvl w:ilvl="5">
+      <w:start w:val="1"/>
+      <w:numFmt w:val="decimal"/>
+      <w:isLgl/>
+      <w:lvlText w:val="%1.%2.%3.%4.%5.%6"/>
+      <w:lvlJc w:val="left"/>
+      <w:pPr>
+        <w:ind w:left="1440" w:hanging="1080"/>
+      </w:pPr>
+      <w:rPr>
+        <w:rFonts w:hint="default"/>
+      </w:rPr>
+    </w:lvl>
+    <w:lvl w:ilvl="6">
+      <w:start w:val="1"/>
+      <w:numFmt w:val="decimal"/>
+      <w:isLgl/>
+      <w:lvlText w:val="%1.%2.%3.%4.%5.%6.%7"/>
+      <w:lvlJc w:val="left"/>
+      <w:pPr>
+        <w:ind w:left="1800" w:hanging="1440"/>
+      </w:pPr>
+      <w:rPr>
+        <w:rFonts w:hint="default"/>
+      </w:rPr>
+    </w:lvl>
+    <w:lvl w:ilvl="7">
+      <w:start w:val="1"/>
+      <w:numFmt w:val="decimal"/>
+      <w:isLgl/>
+      <w:lvlText w:val="%1.%2.%3.%4.%5.%6.%7.%8"/>
+      <w:lvlJc w:val="left"/>
+      <w:pPr>
+        <w:ind w:left="1800" w:hanging="1440"/>
+      </w:pPr>
+      <w:rPr>
+        <w:rFonts w:hint="default"/>
+      </w:rPr>
+    </w:lvl>
+    <w:lvl w:ilvl="8">
+      <w:start w:val="1"/>
+      <w:numFmt w:val="decimal"/>
+      <w:isLgl/>
+      <w:lvlText w:val="%1.%2.%3.%4.%5.%6.%7.%8.%9"/>
+      <w:lvlJc w:val="left"/>
+      <w:pPr>
+        <w:ind w:left="1800" w:hanging="1440"/>
+      </w:pPr>
+      <w:rPr>
+        <w:rFonts w:hint="default"/>
+      </w:rPr>
+    </w:lvl>
+  </w:abstractNum>
   <w:num w:numId="1" w16cid:durableId="886915133">
-    <w:abstractNumId w:val="29"/>
+    <w:abstractNumId w:val="32"/>
   </w:num>
   <w:num w:numId="2" w16cid:durableId="260184172">
-    <w:abstractNumId w:val="35"/>
+    <w:abstractNumId w:val="38"/>
   </w:num>
   <w:num w:numId="3" w16cid:durableId="1738160831">
     <w:abstractNumId w:val="1"/>
   </w:num>
   <w:num w:numId="4" w16cid:durableId="2002734290">
-    <w:abstractNumId w:val="28"/>
+    <w:abstractNumId w:val="31"/>
   </w:num>
   <w:num w:numId="5" w16cid:durableId="1966042056">
-    <w:abstractNumId w:val="23"/>
+    <w:abstractNumId w:val="26"/>
   </w:num>
   <w:num w:numId="6" w16cid:durableId="250549568">
-    <w:abstractNumId w:val="24"/>
+    <w:abstractNumId w:val="27"/>
   </w:num>
   <w:num w:numId="7" w16cid:durableId="1322662321">
     <w:abstractNumId w:val="10"/>
   </w:num>
   <w:num w:numId="8" w16cid:durableId="1139374756">
-    <w:abstractNumId w:val="20"/>
+    <w:abstractNumId w:val="23"/>
   </w:num>
   <w:num w:numId="9" w16cid:durableId="1418283196">
-    <w:abstractNumId w:val="22"/>
+    <w:abstractNumId w:val="25"/>
   </w:num>
   <w:num w:numId="10" w16cid:durableId="317924423">
     <w:abstractNumId w:val="8"/>
   </w:num>
   <w:num w:numId="11" w16cid:durableId="1052847847">
-    <w:abstractNumId w:val="19"/>
+    <w:abstractNumId w:val="22"/>
   </w:num>
   <w:num w:numId="12" w16cid:durableId="752707573">
     <w:abstractNumId w:val="9"/>
   </w:num>
   <w:num w:numId="13" w16cid:durableId="728310756">
-    <w:abstractNumId w:val="34"/>
+    <w:abstractNumId w:val="37"/>
   </w:num>
   <w:num w:numId="14" w16cid:durableId="1184242767">
-    <w:abstractNumId w:val="11"/>
+    <w:abstractNumId w:val="12"/>
   </w:num>
   <w:num w:numId="15" w16cid:durableId="559942666">
     <w:abstractNumId w:val="0"/>
@@ -14166,40 +16395,40 @@
     <w:abstractNumId w:val="3"/>
   </w:num>
   <w:num w:numId="17" w16cid:durableId="1322198190">
-    <w:abstractNumId w:val="31"/>
+    <w:abstractNumId w:val="34"/>
   </w:num>
   <w:num w:numId="18" w16cid:durableId="1765344956">
-    <w:abstractNumId w:val="27"/>
+    <w:abstractNumId w:val="30"/>
   </w:num>
   <w:num w:numId="19" w16cid:durableId="94058861">
-    <w:abstractNumId w:val="12"/>
+    <w:abstractNumId w:val="13"/>
   </w:num>
   <w:num w:numId="20" w16cid:durableId="1624732961">
-    <w:abstractNumId w:val="14"/>
+    <w:abstractNumId w:val="15"/>
   </w:num>
   <w:num w:numId="21" w16cid:durableId="1951811259">
-    <w:abstractNumId w:val="30"/>
+    <w:abstractNumId w:val="33"/>
   </w:num>
   <w:num w:numId="22" w16cid:durableId="2018775070">
     <w:abstractNumId w:val="4"/>
   </w:num>
   <w:num w:numId="23" w16cid:durableId="1697003653">
+    <w:abstractNumId w:val="19"/>
+  </w:num>
+  <w:num w:numId="24" w16cid:durableId="156461198">
+    <w:abstractNumId w:val="18"/>
+  </w:num>
+  <w:num w:numId="25" w16cid:durableId="1929775492">
+    <w:abstractNumId w:val="28"/>
+  </w:num>
+  <w:num w:numId="26" w16cid:durableId="166945697">
     <w:abstractNumId w:val="17"/>
   </w:num>
-  <w:num w:numId="24" w16cid:durableId="156461198">
-    <w:abstractNumId w:val="16"/>
-  </w:num>
-  <w:num w:numId="25" w16cid:durableId="1929775492">
-    <w:abstractNumId w:val="25"/>
-  </w:num>
-  <w:num w:numId="26" w16cid:durableId="166945697">
-    <w:abstractNumId w:val="15"/>
-  </w:num>
   <w:num w:numId="27" w16cid:durableId="1953780169">
-    <w:abstractNumId w:val="18"/>
+    <w:abstractNumId w:val="20"/>
   </w:num>
   <w:num w:numId="28" w16cid:durableId="1381319592">
-    <w:abstractNumId w:val="21"/>
+    <w:abstractNumId w:val="24"/>
   </w:num>
   <w:num w:numId="29" w16cid:durableId="1960063324">
     <w:abstractNumId w:val="7"/>
@@ -14211,19 +16440,31 @@
     <w:abstractNumId w:val="6"/>
   </w:num>
   <w:num w:numId="32" w16cid:durableId="1754820169">
-    <w:abstractNumId w:val="13"/>
+    <w:abstractNumId w:val="14"/>
   </w:num>
   <w:num w:numId="33" w16cid:durableId="461193761">
-    <w:abstractNumId w:val="33"/>
+    <w:abstractNumId w:val="36"/>
   </w:num>
   <w:num w:numId="34" w16cid:durableId="1404841063">
     <w:abstractNumId w:val="5"/>
   </w:num>
   <w:num w:numId="35" w16cid:durableId="1534229671">
-    <w:abstractNumId w:val="32"/>
+    <w:abstractNumId w:val="35"/>
   </w:num>
   <w:num w:numId="36" w16cid:durableId="308829174">
-    <w:abstractNumId w:val="26"/>
+    <w:abstractNumId w:val="29"/>
+  </w:num>
+  <w:num w:numId="37" w16cid:durableId="1913806730">
+    <w:abstractNumId w:val="21"/>
+  </w:num>
+  <w:num w:numId="38" w16cid:durableId="1117986743">
+    <w:abstractNumId w:val="39"/>
+  </w:num>
+  <w:num w:numId="39" w16cid:durableId="914708207">
+    <w:abstractNumId w:val="11"/>
+  </w:num>
+  <w:num w:numId="40" w16cid:durableId="983583283">
+    <w:abstractNumId w:val="16"/>
   </w:num>
 </w:numbering>
 </file>
@@ -14697,6 +16938,7 @@
   <w:style w:type="character" w:default="1" w:styleId="Policepardfaut">
     <w:name w:val="Default Paragraph Font"/>
     <w:uiPriority w:val="1"/>
+    <w:semiHidden/>
     <w:unhideWhenUsed/>
   </w:style>
   <w:style w:type="table" w:default="1" w:styleId="TableauNormal">
@@ -14963,6 +17205,16 @@
         <w:insideV w:val="single" w:sz="4" w:space="0" w:color="auto"/>
       </w:tblBorders>
     </w:tblPr>
+  </w:style>
+  <w:style w:type="character" w:customStyle="1" w:styleId="normaltextrun">
+    <w:name w:val="normaltextrun"/>
+    <w:basedOn w:val="Policepardfaut"/>
+    <w:rsid w:val="00C31310"/>
+  </w:style>
+  <w:style w:type="character" w:customStyle="1" w:styleId="eop">
+    <w:name w:val="eop"/>
+    <w:basedOn w:val="Policepardfaut"/>
+    <w:rsid w:val="00C31310"/>
   </w:style>
 </w:styles>
 </file>

</xml_diff>